<commit_message>
docs: record weekly report reconciliation rules
</commit_message>
<xml_diff>
--- a/docs/learning.docx
+++ b/docs/learning.docx
@@ -7,17 +7,26 @@
         <w:pStyle w:val="Title"/>
       </w:pPr>
       <w:r>
+        <w:rPr>
+          <w:rFonts w:ascii="Arial Unicode MS" w:hAnsi="Arial Unicode MS" w:eastAsia="Arial Unicode MS"/>
+        </w:rPr>
         <w:t>学习文档 — 跨平台智能比价系统</w:t>
       </w:r>
     </w:p>
     <w:p>
       <w:r>
+        <w:rPr>
+          <w:rFonts w:ascii="Arial Unicode MS" w:hAnsi="Arial Unicode MS" w:eastAsia="Arial Unicode MS"/>
+        </w:rPr>
         <w:t>本文件为实时更新的学习记录。每次学到新知识、踩坑、发现新模式，必须立即写入。</w:t>
       </w:r>
     </w:p>
     <w:p>
       <w:r>
-        <w:t>最后更新: 2026-03-19</w:t>
+        <w:rPr>
+          <w:rFonts w:ascii="Arial Unicode MS" w:hAnsi="Arial Unicode MS" w:eastAsia="Arial Unicode MS"/>
+        </w:rPr>
+        <w:t>最后更新: 2026-09-15</w:t>
       </w:r>
     </w:p>
     <w:p>
@@ -25,6 +34,9 @@
         <w:pStyle w:val="Heading1"/>
       </w:pPr>
       <w:r>
+        <w:rPr>
+          <w:rFonts w:ascii="Arial Unicode MS" w:hAnsi="Arial Unicode MS" w:eastAsia="Arial Unicode MS"/>
+        </w:rPr>
         <w:t>项目经验教训</w:t>
       </w:r>
     </w:p>
@@ -46,6 +58,9 @@
           </w:tcPr>
           <w:p>
             <w:r>
+              <w:rPr>
+                <w:rFonts w:ascii="Arial Unicode MS" w:hAnsi="Arial Unicode MS" w:eastAsia="Arial Unicode MS"/>
+              </w:rPr>
               <w:t>日期</w:t>
             </w:r>
           </w:p>
@@ -56,6 +71,9 @@
           </w:tcPr>
           <w:p>
             <w:r>
+              <w:rPr>
+                <w:rFonts w:ascii="Arial Unicode MS" w:hAnsi="Arial Unicode MS" w:eastAsia="Arial Unicode MS"/>
+              </w:rPr>
               <w:t>类别</w:t>
             </w:r>
           </w:p>
@@ -66,6 +84,9 @@
           </w:tcPr>
           <w:p>
             <w:r>
+              <w:rPr>
+                <w:rFonts w:ascii="Arial Unicode MS" w:hAnsi="Arial Unicode MS" w:eastAsia="Arial Unicode MS"/>
+              </w:rPr>
               <w:t>内容</w:t>
             </w:r>
           </w:p>
@@ -78,6 +99,9 @@
           </w:tcPr>
           <w:p>
             <w:r>
+              <w:rPr>
+                <w:rFonts w:ascii="Arial Unicode MS" w:hAnsi="Arial Unicode MS" w:eastAsia="Arial Unicode MS"/>
+              </w:rPr>
               <w:t>2026-03-19</w:t>
             </w:r>
           </w:p>
@@ -88,6 +112,9 @@
           </w:tcPr>
           <w:p>
             <w:r>
+              <w:rPr>
+                <w:rFonts w:ascii="Arial Unicode MS" w:hAnsi="Arial Unicode MS" w:eastAsia="Arial Unicode MS"/>
+              </w:rPr>
               <w:t>配置</w:t>
             </w:r>
           </w:p>
@@ -98,6 +125,9 @@
           </w:tcPr>
           <w:p>
             <w:r>
+              <w:rPr>
+                <w:rFonts w:ascii="Arial Unicode MS" w:hAnsi="Arial Unicode MS" w:eastAsia="Arial Unicode MS"/>
+              </w:rPr>
               <w:t>CLAUDE.md 保持 &lt;200 行，超长会导致 Claude 忽略规则</w:t>
             </w:r>
           </w:p>
@@ -110,6 +140,9 @@
           </w:tcPr>
           <w:p>
             <w:r>
+              <w:rPr>
+                <w:rFonts w:ascii="Arial Unicode MS" w:hAnsi="Arial Unicode MS" w:eastAsia="Arial Unicode MS"/>
+              </w:rPr>
               <w:t>2026-03-19</w:t>
             </w:r>
           </w:p>
@@ -120,6 +153,9 @@
           </w:tcPr>
           <w:p>
             <w:r>
+              <w:rPr>
+                <w:rFonts w:ascii="Arial Unicode MS" w:hAnsi="Arial Unicode MS" w:eastAsia="Arial Unicode MS"/>
+              </w:rPr>
               <w:t>配置</w:t>
             </w:r>
           </w:p>
@@ -130,6 +166,9 @@
           </w:tcPr>
           <w:p>
             <w:r>
+              <w:rPr>
+                <w:rFonts w:ascii="Arial Unicode MS" w:hAnsi="Arial Unicode MS" w:eastAsia="Arial Unicode MS"/>
+              </w:rPr>
               <w:t>项目 CLAUDE.md 不要重复全局规则，只写项目特有的</w:t>
             </w:r>
           </w:p>
@@ -142,6 +181,9 @@
           </w:tcPr>
           <w:p>
             <w:r>
+              <w:rPr>
+                <w:rFonts w:ascii="Arial Unicode MS" w:hAnsi="Arial Unicode MS" w:eastAsia="Arial Unicode MS"/>
+              </w:rPr>
               <w:t>2026-03-19</w:t>
             </w:r>
           </w:p>
@@ -152,6 +194,9 @@
           </w:tcPr>
           <w:p>
             <w:r>
+              <w:rPr>
+                <w:rFonts w:ascii="Arial Unicode MS" w:hAnsi="Arial Unicode MS" w:eastAsia="Arial Unicode MS"/>
+              </w:rPr>
               <w:t>配置</w:t>
             </w:r>
           </w:p>
@@ -162,6 +207,9 @@
           </w:tcPr>
           <w:p>
             <w:r>
+              <w:rPr>
+                <w:rFonts w:ascii="Arial Unicode MS" w:hAnsi="Arial Unicode MS" w:eastAsia="Arial Unicode MS"/>
+              </w:rPr>
               <w:t>.claudeignore 排除大文件(xlsx/json/venv)节省上下文</w:t>
             </w:r>
           </w:p>
@@ -191,6 +239,9 @@
         <w:pStyle w:val="Heading1"/>
       </w:pPr>
       <w:r>
+        <w:rPr>
+          <w:rFonts w:ascii="Arial Unicode MS" w:hAnsi="Arial Unicode MS" w:eastAsia="Arial Unicode MS"/>
+        </w:rPr>
         <w:t>技术知识</w:t>
       </w:r>
     </w:p>
@@ -212,6 +263,9 @@
           </w:tcPr>
           <w:p>
             <w:r>
+              <w:rPr>
+                <w:rFonts w:ascii="Arial Unicode MS" w:hAnsi="Arial Unicode MS" w:eastAsia="Arial Unicode MS"/>
+              </w:rPr>
               <w:t>日期</w:t>
             </w:r>
           </w:p>
@@ -222,6 +276,9 @@
           </w:tcPr>
           <w:p>
             <w:r>
+              <w:rPr>
+                <w:rFonts w:ascii="Arial Unicode MS" w:hAnsi="Arial Unicode MS" w:eastAsia="Arial Unicode MS"/>
+              </w:rPr>
               <w:t>类别</w:t>
             </w:r>
           </w:p>
@@ -232,6 +289,9 @@
           </w:tcPr>
           <w:p>
             <w:r>
+              <w:rPr>
+                <w:rFonts w:ascii="Arial Unicode MS" w:hAnsi="Arial Unicode MS" w:eastAsia="Arial Unicode MS"/>
+              </w:rPr>
               <w:t>内容</w:t>
             </w:r>
           </w:p>
@@ -244,6 +304,9 @@
           </w:tcPr>
           <w:p>
             <w:r>
+              <w:rPr>
+                <w:rFonts w:ascii="Arial Unicode MS" w:hAnsi="Arial Unicode MS" w:eastAsia="Arial Unicode MS"/>
+              </w:rPr>
               <w:t>2026-03-19</w:t>
             </w:r>
           </w:p>
@@ -254,6 +317,9 @@
           </w:tcPr>
           <w:p>
             <w:r>
+              <w:rPr>
+                <w:rFonts w:ascii="Arial Unicode MS" w:hAnsi="Arial Unicode MS" w:eastAsia="Arial Unicode MS"/>
+              </w:rPr>
               <w:t>爬虫</w:t>
             </w:r>
           </w:p>
@@ -264,6 +330,9 @@
           </w:tcPr>
           <w:p>
             <w:r>
+              <w:rPr>
+                <w:rFonts w:ascii="Arial Unicode MS" w:hAnsi="Arial Unicode MS" w:eastAsia="Arial Unicode MS"/>
+              </w:rPr>
               <w:t>得物H5 API已加签名认证(401)，纯HTTP无法调用</w:t>
             </w:r>
           </w:p>
@@ -276,6 +345,9 @@
           </w:tcPr>
           <w:p>
             <w:r>
+              <w:rPr>
+                <w:rFonts w:ascii="Arial Unicode MS" w:hAnsi="Arial Unicode MS" w:eastAsia="Arial Unicode MS"/>
+              </w:rPr>
               <w:t>2026-03-19</w:t>
             </w:r>
           </w:p>
@@ -286,6 +358,9 @@
           </w:tcPr>
           <w:p>
             <w:r>
+              <w:rPr>
+                <w:rFonts w:ascii="Arial Unicode MS" w:hAnsi="Arial Unicode MS" w:eastAsia="Arial Unicode MS"/>
+              </w:rPr>
               <w:t>爬虫</w:t>
             </w:r>
           </w:p>
@@ -296,6 +371,9 @@
           </w:tcPr>
           <w:p>
             <w:r>
+              <w:rPr>
+                <w:rFonts w:ascii="Arial Unicode MS" w:hAnsi="Arial Unicode MS" w:eastAsia="Arial Unicode MS"/>
+              </w:rPr>
               <w:t>识货__NEXT_DATA__含商品列表和全渠道价格</w:t>
             </w:r>
           </w:p>
@@ -308,6 +386,9 @@
           </w:tcPr>
           <w:p>
             <w:r>
+              <w:rPr>
+                <w:rFonts w:ascii="Arial Unicode MS" w:hAnsi="Arial Unicode MS" w:eastAsia="Arial Unicode MS"/>
+              </w:rPr>
               <w:t>2026-03-19</w:t>
             </w:r>
           </w:p>
@@ -318,6 +399,9 @@
           </w:tcPr>
           <w:p>
             <w:r>
+              <w:rPr>
+                <w:rFonts w:ascii="Arial Unicode MS" w:hAnsi="Arial Unicode MS" w:eastAsia="Arial Unicode MS"/>
+              </w:rPr>
               <w:t>爬虫</w:t>
             </w:r>
           </w:p>
@@ -328,6 +412,9 @@
           </w:tcPr>
           <w:p>
             <w:r>
+              <w:rPr>
+                <w:rFonts w:ascii="Arial Unicode MS" w:hAnsi="Arial Unicode MS" w:eastAsia="Arial Unicode MS"/>
+              </w:rPr>
               <w:t>识货搜索对小众/EC专供产品匹配率低</w:t>
             </w:r>
           </w:p>
@@ -340,6 +427,9 @@
           </w:tcPr>
           <w:p>
             <w:r>
+              <w:rPr>
+                <w:rFonts w:ascii="Arial Unicode MS" w:hAnsi="Arial Unicode MS" w:eastAsia="Arial Unicode MS"/>
+              </w:rPr>
               <w:t>2026-03-19</w:t>
             </w:r>
           </w:p>
@@ -350,6 +440,9 @@
           </w:tcPr>
           <w:p>
             <w:r>
+              <w:rPr>
+                <w:rFonts w:ascii="Arial Unicode MS" w:hAnsi="Arial Unicode MS" w:eastAsia="Arial Unicode MS"/>
+              </w:rPr>
               <w:t>爬虫</w:t>
             </w:r>
           </w:p>
@@ -360,6 +453,9 @@
           </w:tcPr>
           <w:p>
             <w:r>
+              <w:rPr>
+                <w:rFonts w:ascii="Arial Unicode MS" w:hAnsi="Arial Unicode MS" w:eastAsia="Arial Unicode MS"/>
+              </w:rPr>
               <w:t>李宁官网/得物/京东均为SPA渲染</w:t>
             </w:r>
           </w:p>
@@ -372,6 +468,9 @@
           </w:tcPr>
           <w:p>
             <w:r>
+              <w:rPr>
+                <w:rFonts w:ascii="Arial Unicode MS" w:hAnsi="Arial Unicode MS" w:eastAsia="Arial Unicode MS"/>
+              </w:rPr>
               <w:t>2026-03-19</w:t>
             </w:r>
           </w:p>
@@ -382,6 +481,9 @@
           </w:tcPr>
           <w:p>
             <w:r>
+              <w:rPr>
+                <w:rFonts w:ascii="Arial Unicode MS" w:hAnsi="Arial Unicode MS" w:eastAsia="Arial Unicode MS"/>
+              </w:rPr>
               <w:t>爬虫</w:t>
             </w:r>
           </w:p>
@@ -392,6 +494,9 @@
           </w:tcPr>
           <w:p>
             <w:r>
+              <w:rPr>
+                <w:rFonts w:ascii="Arial Unicode MS" w:hAnsi="Arial Unicode MS" w:eastAsia="Arial Unicode MS"/>
+              </w:rPr>
               <w:t>httpx async需要httpcore[asyncio]依赖</w:t>
             </w:r>
           </w:p>
@@ -403,6 +508,9 @@
         <w:pStyle w:val="Heading1"/>
       </w:pPr>
       <w:r>
+        <w:rPr>
+          <w:rFonts w:ascii="Arial Unicode MS" w:hAnsi="Arial Unicode MS" w:eastAsia="Arial Unicode MS"/>
+        </w:rPr>
         <w:t>踩坑记录</w:t>
       </w:r>
     </w:p>
@@ -424,6 +532,9 @@
           </w:tcPr>
           <w:p>
             <w:r>
+              <w:rPr>
+                <w:rFonts w:ascii="Arial Unicode MS" w:hAnsi="Arial Unicode MS" w:eastAsia="Arial Unicode MS"/>
+              </w:rPr>
               <w:t>日期</w:t>
             </w:r>
           </w:p>
@@ -434,6 +545,9 @@
           </w:tcPr>
           <w:p>
             <w:r>
+              <w:rPr>
+                <w:rFonts w:ascii="Arial Unicode MS" w:hAnsi="Arial Unicode MS" w:eastAsia="Arial Unicode MS"/>
+              </w:rPr>
               <w:t>问题</w:t>
             </w:r>
           </w:p>
@@ -444,6 +558,9 @@
           </w:tcPr>
           <w:p>
             <w:r>
+              <w:rPr>
+                <w:rFonts w:ascii="Arial Unicode MS" w:hAnsi="Arial Unicode MS" w:eastAsia="Arial Unicode MS"/>
+              </w:rPr>
               <w:t>解决方案</w:t>
             </w:r>
           </w:p>
@@ -456,6 +573,9 @@
           </w:tcPr>
           <w:p>
             <w:r>
+              <w:rPr>
+                <w:rFonts w:ascii="Arial Unicode MS" w:hAnsi="Arial Unicode MS" w:eastAsia="Arial Unicode MS"/>
+              </w:rPr>
               <w:t>2026-03-19</w:t>
             </w:r>
           </w:p>
@@ -466,6 +586,9 @@
           </w:tcPr>
           <w:p>
             <w:r>
+              <w:rPr>
+                <w:rFonts w:ascii="Arial Unicode MS" w:hAnsi="Arial Unicode MS" w:eastAsia="Arial Unicode MS"/>
+              </w:rPr>
               <w:t>识货搜索匹配阈值太低</w:t>
             </w:r>
           </w:p>
@@ -476,6 +599,9 @@
           </w:tcPr>
           <w:p>
             <w:r>
+              <w:rPr>
+                <w:rFonts w:ascii="Arial Unicode MS" w:hAnsi="Arial Unicode MS" w:eastAsia="Arial Unicode MS"/>
+              </w:rPr>
               <w:t>提高阈值，错误数据比没有更危险</w:t>
             </w:r>
           </w:p>
@@ -488,6 +614,9 @@
           </w:tcPr>
           <w:p>
             <w:r>
+              <w:rPr>
+                <w:rFonts w:ascii="Arial Unicode MS" w:hAnsi="Arial Unicode MS" w:eastAsia="Arial Unicode MS"/>
+              </w:rPr>
               <w:t>2026-03-19</w:t>
             </w:r>
           </w:p>
@@ -498,6 +627,9 @@
           </w:tcPr>
           <w:p>
             <w:r>
+              <w:rPr>
+                <w:rFonts w:ascii="Arial Unicode MS" w:hAnsi="Arial Unicode MS" w:eastAsia="Arial Unicode MS"/>
+              </w:rPr>
               <w:t>百度搜索到配件价格(飓风¥79)</w:t>
             </w:r>
           </w:p>
@@ -508,6 +640,9 @@
           </w:tcPr>
           <w:p>
             <w:r>
+              <w:rPr>
+                <w:rFonts w:ascii="Arial Unicode MS" w:hAnsi="Arial Unicode MS" w:eastAsia="Arial Unicode MS"/>
+              </w:rPr>
               <w:t>价格范围校验结合品类</w:t>
             </w:r>
           </w:p>
@@ -520,6 +655,9 @@
           </w:tcPr>
           <w:p>
             <w:r>
+              <w:rPr>
+                <w:rFonts w:ascii="Arial Unicode MS" w:hAnsi="Arial Unicode MS" w:eastAsia="Arial Unicode MS"/>
+              </w:rPr>
               <w:t>2026-03-19</w:t>
             </w:r>
           </w:p>
@@ -530,6 +668,9 @@
           </w:tcPr>
           <w:p>
             <w:r>
+              <w:rPr>
+                <w:rFonts w:ascii="Arial Unicode MS" w:hAnsi="Arial Unicode MS" w:eastAsia="Arial Unicode MS"/>
+              </w:rPr>
               <w:t>补全脚本写入错误价格需回滚</w:t>
             </w:r>
           </w:p>
@@ -540,6 +681,9 @@
           </w:tcPr>
           <w:p>
             <w:r>
+              <w:rPr>
+                <w:rFonts w:ascii="Arial Unicode MS" w:hAnsi="Arial Unicode MS" w:eastAsia="Arial Unicode MS"/>
+              </w:rPr>
               <w:t>先备份缓存再写入</w:t>
             </w:r>
           </w:p>
@@ -551,6 +695,9 @@
         <w:pStyle w:val="Heading1"/>
       </w:pPr>
       <w:r>
+        <w:rPr>
+          <w:rFonts w:ascii="Arial Unicode MS" w:hAnsi="Arial Unicode MS" w:eastAsia="Arial Unicode MS"/>
+        </w:rPr>
         <w:t>架构决策</w:t>
       </w:r>
     </w:p>
@@ -572,6 +719,9 @@
           </w:tcPr>
           <w:p>
             <w:r>
+              <w:rPr>
+                <w:rFonts w:ascii="Arial Unicode MS" w:hAnsi="Arial Unicode MS" w:eastAsia="Arial Unicode MS"/>
+              </w:rPr>
               <w:t>日期</w:t>
             </w:r>
           </w:p>
@@ -582,6 +732,9 @@
           </w:tcPr>
           <w:p>
             <w:r>
+              <w:rPr>
+                <w:rFonts w:ascii="Arial Unicode MS" w:hAnsi="Arial Unicode MS" w:eastAsia="Arial Unicode MS"/>
+              </w:rPr>
               <w:t>决策</w:t>
             </w:r>
           </w:p>
@@ -592,6 +745,9 @@
           </w:tcPr>
           <w:p>
             <w:r>
+              <w:rPr>
+                <w:rFonts w:ascii="Arial Unicode MS" w:hAnsi="Arial Unicode MS" w:eastAsia="Arial Unicode MS"/>
+              </w:rPr>
               <w:t>原因</w:t>
             </w:r>
           </w:p>
@@ -604,6 +760,9 @@
           </w:tcPr>
           <w:p>
             <w:r>
+              <w:rPr>
+                <w:rFonts w:ascii="Arial Unicode MS" w:hAnsi="Arial Unicode MS" w:eastAsia="Arial Unicode MS"/>
+              </w:rPr>
               <w:t>2026-03-19</w:t>
             </w:r>
           </w:p>
@@ -614,6 +773,9 @@
           </w:tcPr>
           <w:p>
             <w:r>
+              <w:rPr>
+                <w:rFonts w:ascii="Arial Unicode MS" w:hAnsi="Arial Unicode MS" w:eastAsia="Arial Unicode MS"/>
+              </w:rPr>
               <w:t>识货详情页作为全渠道价格主要来源</w:t>
             </w:r>
           </w:p>
@@ -624,6 +786,9 @@
           </w:tcPr>
           <w:p>
             <w:r>
+              <w:rPr>
+                <w:rFonts w:ascii="Arial Unicode MS" w:hAnsi="Arial Unicode MS" w:eastAsia="Arial Unicode MS"/>
+              </w:rPr>
               <w:t>一次请求获得5个平台价格</w:t>
             </w:r>
           </w:p>
@@ -636,6 +801,9 @@
           </w:tcPr>
           <w:p>
             <w:r>
+              <w:rPr>
+                <w:rFonts w:ascii="Arial Unicode MS" w:hAnsi="Arial Unicode MS" w:eastAsia="Arial Unicode MS"/>
+              </w:rPr>
               <w:t>2026-03-19</w:t>
             </w:r>
           </w:p>
@@ -646,6 +814,9 @@
           </w:tcPr>
           <w:p>
             <w:r>
+              <w:rPr>
+                <w:rFonts w:ascii="Arial Unicode MS" w:hAnsi="Arial Unicode MS" w:eastAsia="Arial Unicode MS"/>
+              </w:rPr>
               <w:t>缺识货映射的产品需浏览器渲染</w:t>
             </w:r>
           </w:p>
@@ -656,12 +827,100 @@
           </w:tcPr>
           <w:p>
             <w:r>
+              <w:rPr>
+                <w:rFonts w:ascii="Arial Unicode MS" w:hAnsi="Arial Unicode MS" w:eastAsia="Arial Unicode MS"/>
+              </w:rPr>
               <w:t>SPA站点HTTP无效</w:t>
             </w:r>
           </w:p>
         </w:tc>
       </w:tr>
     </w:tbl>
+    <w:p>
+      <w:pPr>
+        <w:pStyle w:val="Heading1"/>
+        <w:pageBreakBefore/>
+      </w:pPr>
+      <w:r>
+        <w:rPr>
+          <w:rFonts w:ascii="Arial Unicode MS" w:hAnsi="Arial Unicode MS" w:eastAsia="Arial Unicode MS"/>
+          <w:color w:val="000000"/>
+        </w:rPr>
+        <w:t>风云周报口径复盘 2026年9月15日</w:t>
+      </w:r>
+    </w:p>
+    <w:p>
+      <w:pPr>
+        <w:pStyle w:val="Heading2"/>
+      </w:pPr>
+      <w:r>
+        <w:rPr>
+          <w:rFonts w:ascii="Arial Unicode MS" w:hAnsi="Arial Unicode MS" w:eastAsia="Arial Unicode MS"/>
+          <w:color w:val="000000"/>
+        </w:rPr>
+        <w:t>免考核店铺必须完整展示</w:t>
+      </w:r>
+    </w:p>
+    <w:p>
+      <w:pPr>
+        <w:spacing w:after="240"/>
+      </w:pPr>
+      <w:r>
+        <w:rPr>
+          <w:rFonts w:ascii="Arial Unicode MS" w:hAnsi="Arial Unicode MS" w:eastAsia="Arial Unicode MS"/>
+          <w:sz w:val="22"/>
+        </w:rPr>
+        <w:t>三次及以上免考核店铺表必须同时展示盈利、亏损及缺数据待补的店铺，不能只筛选利润为负的记录；缺数据不得按零利润填充。</w:t>
+      </w:r>
+    </w:p>
+    <w:p>
+      <w:pPr>
+        <w:pStyle w:val="Heading2"/>
+      </w:pPr>
+      <w:r>
+        <w:rPr>
+          <w:rFonts w:ascii="Arial Unicode MS" w:hAnsi="Arial Unicode MS" w:eastAsia="Arial Unicode MS"/>
+          <w:color w:val="000000"/>
+        </w:rPr>
+        <w:t>商务归属须以确认信息为准</w:t>
+      </w:r>
+    </w:p>
+    <w:p>
+      <w:pPr>
+        <w:spacing w:after="240"/>
+      </w:pPr>
+      <w:r>
+        <w:rPr>
+          <w:rFonts w:ascii="Arial Unicode MS" w:hAnsi="Arial Unicode MS" w:eastAsia="Arial Unicode MS"/>
+          <w:sz w:val="22"/>
+        </w:rPr>
+        <w:t>待补登记姓名不等于已确认商务归属。报告按负责人确认结果更正时，须联动个人金额、环比、店数和最大贡献店，并验证团队金额守恒；报告更正不代表生产登记已更正。</w:t>
+      </w:r>
+    </w:p>
+    <w:p>
+      <w:pPr>
+        <w:pStyle w:val="Heading2"/>
+      </w:pPr>
+      <w:r>
+        <w:rPr>
+          <w:rFonts w:ascii="Arial Unicode MS" w:hAnsi="Arial Unicode MS" w:eastAsia="Arial Unicode MS"/>
+          <w:color w:val="000000"/>
+        </w:rPr>
+        <w:t>渠道投入与产出使用同一范围</w:t>
+      </w:r>
+    </w:p>
+    <w:p>
+      <w:pPr>
+        <w:spacing w:after="240"/>
+      </w:pPr>
+      <w:r>
+        <w:rPr>
+          <w:rFonts w:ascii="Arial Unicode MS" w:hAnsi="Arial Unicode MS" w:eastAsia="Arial Unicode MS"/>
+          <w:sz w:val="22"/>
+        </w:rPr>
+        <w:t>渠道全量红包和其中免考核红包、发车、窗口产出必须按同一商品、渠道和时间范围拆分。用户举例金额不得直接当成核实值；实际值须从同一范围的排单明细核对，并记录查询时间。</w:t>
+      </w:r>
+    </w:p>
     <w:sectPr>
       <w:pgSz w:w="12240" w:h="15840"/>
       <w:pgMar w:top="1440" w:right="1800" w:bottom="1440" w:left="1800" w:header="720" w:footer="720" w:gutter="0"/>
@@ -1035,6 +1294,9 @@
     <w:name w:val="Normal"/>
     <w:qFormat/>
     <w:rsid w:val="00FC693F"/>
+    <w:rPr>
+      <w:rFonts w:ascii="Arial Unicode MS" w:hAnsi="Arial Unicode MS" w:eastAsia="Arial Unicode MS"/>
+    </w:rPr>
   </w:style>
   <w:style w:type="paragraph" w:styleId="Header">
     <w:name w:val="header"/>
@@ -1050,6 +1312,9 @@
       </w:tabs>
       <w:spacing w:after="0" w:line="240" w:lineRule="auto"/>
     </w:pPr>
+    <w:rPr>
+      <w:rFonts w:ascii="Arial Unicode MS" w:hAnsi="Arial Unicode MS" w:eastAsia="Arial Unicode MS"/>
+    </w:rPr>
   </w:style>
   <w:style w:type="character" w:customStyle="1" w:styleId="HeaderChar">
     <w:name w:val="Header Char"/>
@@ -1057,6 +1322,9 @@
     <w:link w:val="Header"/>
     <w:uiPriority w:val="99"/>
     <w:rsid w:val="00E618BF"/>
+    <w:rPr>
+      <w:rFonts w:ascii="Arial Unicode MS" w:hAnsi="Arial Unicode MS" w:eastAsia="Arial Unicode MS"/>
+    </w:rPr>
   </w:style>
   <w:style w:type="paragraph" w:styleId="Footer">
     <w:name w:val="footer"/>
@@ -1072,6 +1340,9 @@
       </w:tabs>
       <w:spacing w:after="0" w:line="240" w:lineRule="auto"/>
     </w:pPr>
+    <w:rPr>
+      <w:rFonts w:ascii="Arial Unicode MS" w:hAnsi="Arial Unicode MS" w:eastAsia="Arial Unicode MS"/>
+    </w:rPr>
   </w:style>
   <w:style w:type="character" w:customStyle="1" w:styleId="FooterChar">
     <w:name w:val="Footer Char"/>
@@ -1079,6 +1350,9 @@
     <w:link w:val="Footer"/>
     <w:uiPriority w:val="99"/>
     <w:rsid w:val="00E618BF"/>
+    <w:rPr>
+      <w:rFonts w:ascii="Arial Unicode MS" w:hAnsi="Arial Unicode MS" w:eastAsia="Arial Unicode MS"/>
+    </w:rPr>
   </w:style>
   <w:style w:type="paragraph" w:styleId="Heading1">
     <w:name w:val="heading 1"/>
@@ -1095,7 +1369,7 @@
       <w:outlineLvl w:val="0"/>
     </w:pPr>
     <w:rPr>
-      <w:rFonts w:asciiTheme="majorHAnsi" w:eastAsiaTheme="majorEastAsia" w:hAnsiTheme="majorHAnsi" w:cstheme="majorBidi"/>
+      <w:rFonts w:asciiTheme="majorHAnsi" w:eastAsiaTheme="majorEastAsia" w:hAnsiTheme="majorHAnsi" w:cstheme="majorBidi" w:ascii="Arial Unicode MS" w:hAnsi="Arial Unicode MS" w:eastAsia="Arial Unicode MS"/>
       <w:b/>
       <w:bCs/>
       <w:color w:val="365F91" w:themeColor="accent1" w:themeShade="BF"/>
@@ -1119,7 +1393,7 @@
       <w:outlineLvl w:val="1"/>
     </w:pPr>
     <w:rPr>
-      <w:rFonts w:asciiTheme="majorHAnsi" w:eastAsiaTheme="majorEastAsia" w:hAnsiTheme="majorHAnsi" w:cstheme="majorBidi"/>
+      <w:rFonts w:asciiTheme="majorHAnsi" w:eastAsiaTheme="majorEastAsia" w:hAnsiTheme="majorHAnsi" w:cstheme="majorBidi" w:ascii="Arial Unicode MS" w:hAnsi="Arial Unicode MS" w:eastAsia="Arial Unicode MS"/>
       <w:b/>
       <w:bCs/>
       <w:color w:val="4F81BD" w:themeColor="accent1"/>
@@ -1143,7 +1417,7 @@
       <w:outlineLvl w:val="2"/>
     </w:pPr>
     <w:rPr>
-      <w:rFonts w:asciiTheme="majorHAnsi" w:eastAsiaTheme="majorEastAsia" w:hAnsiTheme="majorHAnsi" w:cstheme="majorBidi"/>
+      <w:rFonts w:asciiTheme="majorHAnsi" w:eastAsiaTheme="majorEastAsia" w:hAnsiTheme="majorHAnsi" w:cstheme="majorBidi" w:ascii="Arial Unicode MS" w:hAnsi="Arial Unicode MS" w:eastAsia="Arial Unicode MS"/>
       <w:b/>
       <w:bCs/>
       <w:color w:val="4F81BD" w:themeColor="accent1"/>
@@ -1166,7 +1440,7 @@
       <w:outlineLvl w:val="3"/>
     </w:pPr>
     <w:rPr>
-      <w:rFonts w:asciiTheme="majorHAnsi" w:eastAsiaTheme="majorEastAsia" w:hAnsiTheme="majorHAnsi" w:cstheme="majorBidi"/>
+      <w:rFonts w:asciiTheme="majorHAnsi" w:eastAsiaTheme="majorEastAsia" w:hAnsiTheme="majorHAnsi" w:cstheme="majorBidi" w:ascii="Arial Unicode MS" w:hAnsi="Arial Unicode MS" w:eastAsia="Arial Unicode MS"/>
       <w:b/>
       <w:bCs/>
       <w:i/>
@@ -1191,7 +1465,7 @@
       <w:outlineLvl w:val="4"/>
     </w:pPr>
     <w:rPr>
-      <w:rFonts w:asciiTheme="majorHAnsi" w:eastAsiaTheme="majorEastAsia" w:hAnsiTheme="majorHAnsi" w:cstheme="majorBidi"/>
+      <w:rFonts w:asciiTheme="majorHAnsi" w:eastAsiaTheme="majorEastAsia" w:hAnsiTheme="majorHAnsi" w:cstheme="majorBidi" w:ascii="Arial Unicode MS" w:hAnsi="Arial Unicode MS" w:eastAsia="Arial Unicode MS"/>
       <w:color w:val="243F60" w:themeColor="accent1" w:themeShade="7F"/>
     </w:rPr>
   </w:style>
@@ -1212,7 +1486,7 @@
       <w:outlineLvl w:val="5"/>
     </w:pPr>
     <w:rPr>
-      <w:rFonts w:asciiTheme="majorHAnsi" w:eastAsiaTheme="majorEastAsia" w:hAnsiTheme="majorHAnsi" w:cstheme="majorBidi"/>
+      <w:rFonts w:asciiTheme="majorHAnsi" w:eastAsiaTheme="majorEastAsia" w:hAnsiTheme="majorHAnsi" w:cstheme="majorBidi" w:ascii="Arial Unicode MS" w:hAnsi="Arial Unicode MS" w:eastAsia="Arial Unicode MS"/>
       <w:i/>
       <w:iCs/>
       <w:color w:val="243F60" w:themeColor="accent1" w:themeShade="7F"/>
@@ -1235,7 +1509,7 @@
       <w:outlineLvl w:val="6"/>
     </w:pPr>
     <w:rPr>
-      <w:rFonts w:asciiTheme="majorHAnsi" w:eastAsiaTheme="majorEastAsia" w:hAnsiTheme="majorHAnsi" w:cstheme="majorBidi"/>
+      <w:rFonts w:asciiTheme="majorHAnsi" w:eastAsiaTheme="majorEastAsia" w:hAnsiTheme="majorHAnsi" w:cstheme="majorBidi" w:ascii="Arial Unicode MS" w:hAnsi="Arial Unicode MS" w:eastAsia="Arial Unicode MS"/>
       <w:i/>
       <w:iCs/>
       <w:color w:val="404040" w:themeColor="text1" w:themeTint="BF"/>
@@ -1258,7 +1532,7 @@
       <w:outlineLvl w:val="7"/>
     </w:pPr>
     <w:rPr>
-      <w:rFonts w:asciiTheme="majorHAnsi" w:eastAsiaTheme="majorEastAsia" w:hAnsiTheme="majorHAnsi" w:cstheme="majorBidi"/>
+      <w:rFonts w:asciiTheme="majorHAnsi" w:eastAsiaTheme="majorEastAsia" w:hAnsiTheme="majorHAnsi" w:cstheme="majorBidi" w:ascii="Arial Unicode MS" w:hAnsi="Arial Unicode MS" w:eastAsia="Arial Unicode MS"/>
       <w:color w:val="4F81BD" w:themeColor="accent1"/>
       <w:sz w:val="20"/>
       <w:szCs w:val="20"/>
@@ -1281,7 +1555,7 @@
       <w:outlineLvl w:val="8"/>
     </w:pPr>
     <w:rPr>
-      <w:rFonts w:asciiTheme="majorHAnsi" w:eastAsiaTheme="majorEastAsia" w:hAnsiTheme="majorHAnsi" w:cstheme="majorBidi"/>
+      <w:rFonts w:asciiTheme="majorHAnsi" w:eastAsiaTheme="majorEastAsia" w:hAnsiTheme="majorHAnsi" w:cstheme="majorBidi" w:ascii="Arial Unicode MS" w:hAnsi="Arial Unicode MS" w:eastAsia="Arial Unicode MS"/>
       <w:i/>
       <w:iCs/>
       <w:color w:val="404040" w:themeColor="text1" w:themeTint="BF"/>
@@ -1294,12 +1568,18 @@
     <w:uiPriority w:val="1"/>
     <w:semiHidden/>
     <w:unhideWhenUsed/>
+    <w:rPr>
+      <w:rFonts w:ascii="Arial Unicode MS" w:hAnsi="Arial Unicode MS" w:eastAsia="Arial Unicode MS"/>
+    </w:rPr>
   </w:style>
   <w:style w:type="table" w:default="1" w:styleId="TableNormal">
     <w:name w:val="Normal Table"/>
     <w:uiPriority w:val="99"/>
     <w:semiHidden/>
     <w:unhideWhenUsed/>
+    <w:rPr>
+      <w:rFonts w:ascii="Arial Unicode MS" w:hAnsi="Arial Unicode MS" w:eastAsia="Arial Unicode MS"/>
+    </w:rPr>
     <w:tblPr>
       <w:tblInd w:w="0" w:type="dxa"/>
       <w:tblCellMar>
@@ -1324,6 +1604,9 @@
     <w:pPr>
       <w:spacing w:after="0" w:line="240" w:lineRule="auto"/>
     </w:pPr>
+    <w:rPr>
+      <w:rFonts w:ascii="Arial Unicode MS" w:hAnsi="Arial Unicode MS" w:eastAsia="Arial Unicode MS"/>
+    </w:rPr>
   </w:style>
   <w:style w:type="character" w:customStyle="1" w:styleId="Heading1Char">
     <w:name w:val="Heading 1 Char"/>
@@ -1332,7 +1615,7 @@
     <w:uiPriority w:val="9"/>
     <w:rsid w:val="00FC693F"/>
     <w:rPr>
-      <w:rFonts w:asciiTheme="majorHAnsi" w:eastAsiaTheme="majorEastAsia" w:hAnsiTheme="majorHAnsi" w:cstheme="majorBidi"/>
+      <w:rFonts w:asciiTheme="majorHAnsi" w:eastAsiaTheme="majorEastAsia" w:hAnsiTheme="majorHAnsi" w:cstheme="majorBidi" w:ascii="Arial Unicode MS" w:hAnsi="Arial Unicode MS" w:eastAsia="Arial Unicode MS"/>
       <w:b/>
       <w:bCs/>
       <w:color w:val="365F91" w:themeColor="accent1" w:themeShade="BF"/>
@@ -1347,7 +1630,7 @@
     <w:uiPriority w:val="9"/>
     <w:rsid w:val="00FC693F"/>
     <w:rPr>
-      <w:rFonts w:asciiTheme="majorHAnsi" w:eastAsiaTheme="majorEastAsia" w:hAnsiTheme="majorHAnsi" w:cstheme="majorBidi"/>
+      <w:rFonts w:asciiTheme="majorHAnsi" w:eastAsiaTheme="majorEastAsia" w:hAnsiTheme="majorHAnsi" w:cstheme="majorBidi" w:ascii="Arial Unicode MS" w:hAnsi="Arial Unicode MS" w:eastAsia="Arial Unicode MS"/>
       <w:b/>
       <w:bCs/>
       <w:color w:val="4F81BD" w:themeColor="accent1"/>
@@ -1362,7 +1645,7 @@
     <w:uiPriority w:val="9"/>
     <w:rsid w:val="00FC693F"/>
     <w:rPr>
-      <w:rFonts w:asciiTheme="majorHAnsi" w:eastAsiaTheme="majorEastAsia" w:hAnsiTheme="majorHAnsi" w:cstheme="majorBidi"/>
+      <w:rFonts w:asciiTheme="majorHAnsi" w:eastAsiaTheme="majorEastAsia" w:hAnsiTheme="majorHAnsi" w:cstheme="majorBidi" w:ascii="Arial Unicode MS" w:hAnsi="Arial Unicode MS" w:eastAsia="Arial Unicode MS"/>
       <w:b/>
       <w:bCs/>
       <w:color w:val="4F81BD" w:themeColor="accent1"/>
@@ -1384,7 +1667,7 @@
       <w:contextualSpacing/>
     </w:pPr>
     <w:rPr>
-      <w:rFonts w:asciiTheme="majorHAnsi" w:eastAsiaTheme="majorEastAsia" w:hAnsiTheme="majorHAnsi" w:cstheme="majorBidi"/>
+      <w:rFonts w:asciiTheme="majorHAnsi" w:eastAsiaTheme="majorEastAsia" w:hAnsiTheme="majorHAnsi" w:cstheme="majorBidi" w:ascii="Arial Unicode MS" w:hAnsi="Arial Unicode MS" w:eastAsia="Arial Unicode MS"/>
       <w:color w:val="17365D" w:themeColor="text2" w:themeShade="BF"/>
       <w:spacing w:val="5"/>
       <w:kern w:val="28"/>
@@ -1399,7 +1682,7 @@
     <w:uiPriority w:val="10"/>
     <w:rsid w:val="00FC693F"/>
     <w:rPr>
-      <w:rFonts w:asciiTheme="majorHAnsi" w:eastAsiaTheme="majorEastAsia" w:hAnsiTheme="majorHAnsi" w:cstheme="majorBidi"/>
+      <w:rFonts w:asciiTheme="majorHAnsi" w:eastAsiaTheme="majorEastAsia" w:hAnsiTheme="majorHAnsi" w:cstheme="majorBidi" w:ascii="Arial Unicode MS" w:hAnsi="Arial Unicode MS" w:eastAsia="Arial Unicode MS"/>
       <w:color w:val="17365D" w:themeColor="text2" w:themeShade="BF"/>
       <w:spacing w:val="5"/>
       <w:kern w:val="28"/>
@@ -1421,7 +1704,7 @@
       </w:numPr>
     </w:pPr>
     <w:rPr>
-      <w:rFonts w:asciiTheme="majorHAnsi" w:eastAsiaTheme="majorEastAsia" w:hAnsiTheme="majorHAnsi" w:cstheme="majorBidi"/>
+      <w:rFonts w:asciiTheme="majorHAnsi" w:eastAsiaTheme="majorEastAsia" w:hAnsiTheme="majorHAnsi" w:cstheme="majorBidi" w:ascii="Arial Unicode MS" w:hAnsi="Arial Unicode MS" w:eastAsia="Arial Unicode MS"/>
       <w:i/>
       <w:iCs/>
       <w:color w:val="4F81BD" w:themeColor="accent1"/>
@@ -1437,7 +1720,7 @@
     <w:uiPriority w:val="11"/>
     <w:rsid w:val="00FC693F"/>
     <w:rPr>
-      <w:rFonts w:asciiTheme="majorHAnsi" w:eastAsiaTheme="majorEastAsia" w:hAnsiTheme="majorHAnsi" w:cstheme="majorBidi"/>
+      <w:rFonts w:asciiTheme="majorHAnsi" w:eastAsiaTheme="majorEastAsia" w:hAnsiTheme="majorHAnsi" w:cstheme="majorBidi" w:ascii="Arial Unicode MS" w:hAnsi="Arial Unicode MS" w:eastAsia="Arial Unicode MS"/>
       <w:i/>
       <w:iCs/>
       <w:color w:val="4F81BD" w:themeColor="accent1"/>
@@ -1456,6 +1739,9 @@
       <w:ind w:left="720"/>
       <w:contextualSpacing/>
     </w:pPr>
+    <w:rPr>
+      <w:rFonts w:ascii="Arial Unicode MS" w:hAnsi="Arial Unicode MS" w:eastAsia="Arial Unicode MS"/>
+    </w:rPr>
   </w:style>
   <w:style w:type="paragraph" w:styleId="BodyText">
     <w:name w:val="Body Text"/>
@@ -1467,6 +1753,9 @@
     <w:pPr>
       <w:spacing w:after="120"/>
     </w:pPr>
+    <w:rPr>
+      <w:rFonts w:ascii="Arial Unicode MS" w:hAnsi="Arial Unicode MS" w:eastAsia="Arial Unicode MS"/>
+    </w:rPr>
   </w:style>
   <w:style w:type="character" w:customStyle="1" w:styleId="BodyTextChar">
     <w:name w:val="Body Text Char"/>
@@ -1474,6 +1763,9 @@
     <w:link w:val="BodyText"/>
     <w:uiPriority w:val="99"/>
     <w:rsid w:val="00AA1D8D"/>
+    <w:rPr>
+      <w:rFonts w:ascii="Arial Unicode MS" w:hAnsi="Arial Unicode MS" w:eastAsia="Arial Unicode MS"/>
+    </w:rPr>
   </w:style>
   <w:style w:type="paragraph" w:styleId="BodyText2">
     <w:name w:val="Body Text 2"/>
@@ -1485,6 +1777,9 @@
     <w:pPr>
       <w:spacing w:after="120" w:line="480" w:lineRule="auto"/>
     </w:pPr>
+    <w:rPr>
+      <w:rFonts w:ascii="Arial Unicode MS" w:hAnsi="Arial Unicode MS" w:eastAsia="Arial Unicode MS"/>
+    </w:rPr>
   </w:style>
   <w:style w:type="character" w:customStyle="1" w:styleId="BodyText2Char">
     <w:name w:val="Body Text 2 Char"/>
@@ -1492,6 +1787,9 @@
     <w:link w:val="BodyText2"/>
     <w:uiPriority w:val="99"/>
     <w:rsid w:val="00AA1D8D"/>
+    <w:rPr>
+      <w:rFonts w:ascii="Arial Unicode MS" w:hAnsi="Arial Unicode MS" w:eastAsia="Arial Unicode MS"/>
+    </w:rPr>
   </w:style>
   <w:style w:type="paragraph" w:styleId="BodyText3">
     <w:name w:val="Body Text 3"/>
@@ -1504,6 +1802,7 @@
       <w:spacing w:after="120"/>
     </w:pPr>
     <w:rPr>
+      <w:rFonts w:ascii="Arial Unicode MS" w:hAnsi="Arial Unicode MS" w:eastAsia="Arial Unicode MS"/>
       <w:sz w:val="16"/>
       <w:szCs w:val="16"/>
     </w:rPr>
@@ -1515,6 +1814,7 @@
     <w:uiPriority w:val="99"/>
     <w:rsid w:val="00AA1D8D"/>
     <w:rPr>
+      <w:rFonts w:ascii="Arial Unicode MS" w:hAnsi="Arial Unicode MS" w:eastAsia="Arial Unicode MS"/>
       <w:sz w:val="16"/>
       <w:szCs w:val="16"/>
     </w:rPr>
@@ -1529,6 +1829,9 @@
       <w:ind w:left="360" w:hanging="360"/>
       <w:contextualSpacing/>
     </w:pPr>
+    <w:rPr>
+      <w:rFonts w:ascii="Arial Unicode MS" w:hAnsi="Arial Unicode MS" w:eastAsia="Arial Unicode MS"/>
+    </w:rPr>
   </w:style>
   <w:style w:type="paragraph" w:styleId="List2">
     <w:name w:val="List 2"/>
@@ -1540,6 +1843,9 @@
       <w:ind w:left="720" w:hanging="360"/>
       <w:contextualSpacing/>
     </w:pPr>
+    <w:rPr>
+      <w:rFonts w:ascii="Arial Unicode MS" w:hAnsi="Arial Unicode MS" w:eastAsia="Arial Unicode MS"/>
+    </w:rPr>
   </w:style>
   <w:style w:type="paragraph" w:styleId="List3">
     <w:name w:val="List 3"/>
@@ -1551,6 +1857,9 @@
       <w:ind w:left="1080" w:hanging="360"/>
       <w:contextualSpacing/>
     </w:pPr>
+    <w:rPr>
+      <w:rFonts w:ascii="Arial Unicode MS" w:hAnsi="Arial Unicode MS" w:eastAsia="Arial Unicode MS"/>
+    </w:rPr>
   </w:style>
   <w:style w:type="paragraph" w:styleId="ListBullet">
     <w:name w:val="List Bullet"/>
@@ -1564,6 +1873,9 @@
       </w:numPr>
       <w:contextualSpacing/>
     </w:pPr>
+    <w:rPr>
+      <w:rFonts w:ascii="Arial Unicode MS" w:hAnsi="Arial Unicode MS" w:eastAsia="Arial Unicode MS"/>
+    </w:rPr>
   </w:style>
   <w:style w:type="paragraph" w:styleId="ListBullet2">
     <w:name w:val="List Bullet 2"/>
@@ -1577,6 +1889,9 @@
       </w:numPr>
       <w:contextualSpacing/>
     </w:pPr>
+    <w:rPr>
+      <w:rFonts w:ascii="Arial Unicode MS" w:hAnsi="Arial Unicode MS" w:eastAsia="Arial Unicode MS"/>
+    </w:rPr>
   </w:style>
   <w:style w:type="paragraph" w:styleId="ListBullet3">
     <w:name w:val="List Bullet 3"/>
@@ -1590,6 +1905,9 @@
       </w:numPr>
       <w:contextualSpacing/>
     </w:pPr>
+    <w:rPr>
+      <w:rFonts w:ascii="Arial Unicode MS" w:hAnsi="Arial Unicode MS" w:eastAsia="Arial Unicode MS"/>
+    </w:rPr>
   </w:style>
   <w:style w:type="paragraph" w:styleId="ListNumber">
     <w:name w:val="List Number"/>
@@ -1603,6 +1921,9 @@
       </w:numPr>
       <w:contextualSpacing/>
     </w:pPr>
+    <w:rPr>
+      <w:rFonts w:ascii="Arial Unicode MS" w:hAnsi="Arial Unicode MS" w:eastAsia="Arial Unicode MS"/>
+    </w:rPr>
   </w:style>
   <w:style w:type="paragraph" w:styleId="ListNumber2">
     <w:name w:val="List Number 2"/>
@@ -1616,6 +1937,9 @@
       </w:numPr>
       <w:contextualSpacing/>
     </w:pPr>
+    <w:rPr>
+      <w:rFonts w:ascii="Arial Unicode MS" w:hAnsi="Arial Unicode MS" w:eastAsia="Arial Unicode MS"/>
+    </w:rPr>
   </w:style>
   <w:style w:type="paragraph" w:styleId="ListNumber3">
     <w:name w:val="List Number 3"/>
@@ -1629,6 +1953,9 @@
       </w:numPr>
       <w:contextualSpacing/>
     </w:pPr>
+    <w:rPr>
+      <w:rFonts w:ascii="Arial Unicode MS" w:hAnsi="Arial Unicode MS" w:eastAsia="Arial Unicode MS"/>
+    </w:rPr>
   </w:style>
   <w:style w:type="paragraph" w:styleId="ListContinue">
     <w:name w:val="List Continue"/>
@@ -1641,6 +1968,9 @@
       <w:ind w:left="360"/>
       <w:contextualSpacing/>
     </w:pPr>
+    <w:rPr>
+      <w:rFonts w:ascii="Arial Unicode MS" w:hAnsi="Arial Unicode MS" w:eastAsia="Arial Unicode MS"/>
+    </w:rPr>
   </w:style>
   <w:style w:type="paragraph" w:styleId="ListContinue2">
     <w:name w:val="List Continue 2"/>
@@ -1653,6 +1983,9 @@
       <w:ind w:left="720"/>
       <w:contextualSpacing/>
     </w:pPr>
+    <w:rPr>
+      <w:rFonts w:ascii="Arial Unicode MS" w:hAnsi="Arial Unicode MS" w:eastAsia="Arial Unicode MS"/>
+    </w:rPr>
   </w:style>
   <w:style w:type="paragraph" w:styleId="ListContinue3">
     <w:name w:val="List Continue 3"/>
@@ -1665,6 +1998,9 @@
       <w:ind w:left="1080"/>
       <w:contextualSpacing/>
     </w:pPr>
+    <w:rPr>
+      <w:rFonts w:ascii="Arial Unicode MS" w:hAnsi="Arial Unicode MS" w:eastAsia="Arial Unicode MS"/>
+    </w:rPr>
   </w:style>
   <w:style w:type="paragraph" w:styleId="MacroText">
     <w:name w:val="macro"/>
@@ -1684,7 +2020,7 @@
       </w:tabs>
     </w:pPr>
     <w:rPr>
-      <w:rFonts w:ascii="Courier" w:hAnsi="Courier"/>
+      <w:rFonts w:ascii="Arial Unicode MS" w:hAnsi="Arial Unicode MS" w:eastAsia="Arial Unicode MS"/>
       <w:sz w:val="20"/>
       <w:szCs w:val="20"/>
     </w:rPr>
@@ -1696,7 +2032,7 @@
     <w:uiPriority w:val="99"/>
     <w:rsid w:val="0029639D"/>
     <w:rPr>
-      <w:rFonts w:ascii="Courier" w:hAnsi="Courier"/>
+      <w:rFonts w:ascii="Arial Unicode MS" w:hAnsi="Arial Unicode MS" w:eastAsia="Arial Unicode MS"/>
       <w:sz w:val="20"/>
       <w:szCs w:val="20"/>
     </w:rPr>
@@ -1710,6 +2046,7 @@
     <w:qFormat/>
     <w:rsid w:val="00FC693F"/>
     <w:rPr>
+      <w:rFonts w:ascii="Arial Unicode MS" w:hAnsi="Arial Unicode MS" w:eastAsia="Arial Unicode MS"/>
       <w:i/>
       <w:iCs/>
       <w:color w:val="000000" w:themeColor="text1"/>
@@ -1722,6 +2059,7 @@
     <w:uiPriority w:val="29"/>
     <w:rsid w:val="00FC693F"/>
     <w:rPr>
+      <w:rFonts w:ascii="Arial Unicode MS" w:hAnsi="Arial Unicode MS" w:eastAsia="Arial Unicode MS"/>
       <w:i/>
       <w:iCs/>
       <w:color w:val="000000" w:themeColor="text1"/>
@@ -1735,7 +2073,7 @@
     <w:semiHidden/>
     <w:rsid w:val="00FC693F"/>
     <w:rPr>
-      <w:rFonts w:asciiTheme="majorHAnsi" w:eastAsiaTheme="majorEastAsia" w:hAnsiTheme="majorHAnsi" w:cstheme="majorBidi"/>
+      <w:rFonts w:asciiTheme="majorHAnsi" w:eastAsiaTheme="majorEastAsia" w:hAnsiTheme="majorHAnsi" w:cstheme="majorBidi" w:ascii="Arial Unicode MS" w:hAnsi="Arial Unicode MS" w:eastAsia="Arial Unicode MS"/>
       <w:b/>
       <w:bCs/>
       <w:i/>
@@ -1751,7 +2089,7 @@
     <w:semiHidden/>
     <w:rsid w:val="00FC693F"/>
     <w:rPr>
-      <w:rFonts w:asciiTheme="majorHAnsi" w:eastAsiaTheme="majorEastAsia" w:hAnsiTheme="majorHAnsi" w:cstheme="majorBidi"/>
+      <w:rFonts w:asciiTheme="majorHAnsi" w:eastAsiaTheme="majorEastAsia" w:hAnsiTheme="majorHAnsi" w:cstheme="majorBidi" w:ascii="Arial Unicode MS" w:hAnsi="Arial Unicode MS" w:eastAsia="Arial Unicode MS"/>
       <w:color w:val="243F60" w:themeColor="accent1" w:themeShade="7F"/>
     </w:rPr>
   </w:style>
@@ -1763,7 +2101,7 @@
     <w:semiHidden/>
     <w:rsid w:val="00FC693F"/>
     <w:rPr>
-      <w:rFonts w:asciiTheme="majorHAnsi" w:eastAsiaTheme="majorEastAsia" w:hAnsiTheme="majorHAnsi" w:cstheme="majorBidi"/>
+      <w:rFonts w:asciiTheme="majorHAnsi" w:eastAsiaTheme="majorEastAsia" w:hAnsiTheme="majorHAnsi" w:cstheme="majorBidi" w:ascii="Arial Unicode MS" w:hAnsi="Arial Unicode MS" w:eastAsia="Arial Unicode MS"/>
       <w:i/>
       <w:iCs/>
       <w:color w:val="243F60" w:themeColor="accent1" w:themeShade="7F"/>
@@ -1777,7 +2115,7 @@
     <w:semiHidden/>
     <w:rsid w:val="00FC693F"/>
     <w:rPr>
-      <w:rFonts w:asciiTheme="majorHAnsi" w:eastAsiaTheme="majorEastAsia" w:hAnsiTheme="majorHAnsi" w:cstheme="majorBidi"/>
+      <w:rFonts w:asciiTheme="majorHAnsi" w:eastAsiaTheme="majorEastAsia" w:hAnsiTheme="majorHAnsi" w:cstheme="majorBidi" w:ascii="Arial Unicode MS" w:hAnsi="Arial Unicode MS" w:eastAsia="Arial Unicode MS"/>
       <w:i/>
       <w:iCs/>
       <w:color w:val="404040" w:themeColor="text1" w:themeTint="BF"/>
@@ -1791,7 +2129,7 @@
     <w:semiHidden/>
     <w:rsid w:val="00FC693F"/>
     <w:rPr>
-      <w:rFonts w:asciiTheme="majorHAnsi" w:eastAsiaTheme="majorEastAsia" w:hAnsiTheme="majorHAnsi" w:cstheme="majorBidi"/>
+      <w:rFonts w:asciiTheme="majorHAnsi" w:eastAsiaTheme="majorEastAsia" w:hAnsiTheme="majorHAnsi" w:cstheme="majorBidi" w:ascii="Arial Unicode MS" w:hAnsi="Arial Unicode MS" w:eastAsia="Arial Unicode MS"/>
       <w:color w:val="4F81BD" w:themeColor="accent1"/>
       <w:sz w:val="20"/>
       <w:szCs w:val="20"/>
@@ -1805,7 +2143,7 @@
     <w:semiHidden/>
     <w:rsid w:val="00FC693F"/>
     <w:rPr>
-      <w:rFonts w:asciiTheme="majorHAnsi" w:eastAsiaTheme="majorEastAsia" w:hAnsiTheme="majorHAnsi" w:cstheme="majorBidi"/>
+      <w:rFonts w:asciiTheme="majorHAnsi" w:eastAsiaTheme="majorEastAsia" w:hAnsiTheme="majorHAnsi" w:cstheme="majorBidi" w:ascii="Arial Unicode MS" w:hAnsi="Arial Unicode MS" w:eastAsia="Arial Unicode MS"/>
       <w:i/>
       <w:iCs/>
       <w:color w:val="404040" w:themeColor="text1" w:themeTint="BF"/>
@@ -1826,6 +2164,7 @@
       <w:spacing w:line="240" w:lineRule="auto"/>
     </w:pPr>
     <w:rPr>
+      <w:rFonts w:ascii="Arial Unicode MS" w:hAnsi="Arial Unicode MS" w:eastAsia="Arial Unicode MS"/>
       <w:b/>
       <w:bCs/>
       <w:color w:val="4F81BD" w:themeColor="accent1"/>
@@ -1840,6 +2179,7 @@
     <w:qFormat/>
     <w:rsid w:val="00FC693F"/>
     <w:rPr>
+      <w:rFonts w:ascii="Arial Unicode MS" w:hAnsi="Arial Unicode MS" w:eastAsia="Arial Unicode MS"/>
       <w:b/>
       <w:bCs/>
     </w:rPr>
@@ -1851,6 +2191,7 @@
     <w:qFormat/>
     <w:rsid w:val="00FC693F"/>
     <w:rPr>
+      <w:rFonts w:ascii="Arial Unicode MS" w:hAnsi="Arial Unicode MS" w:eastAsia="Arial Unicode MS"/>
       <w:i/>
       <w:iCs/>
     </w:rPr>
@@ -1871,6 +2212,7 @@
       <w:ind w:left="936" w:right="936"/>
     </w:pPr>
     <w:rPr>
+      <w:rFonts w:ascii="Arial Unicode MS" w:hAnsi="Arial Unicode MS" w:eastAsia="Arial Unicode MS"/>
       <w:b/>
       <w:bCs/>
       <w:i/>
@@ -1885,6 +2227,7 @@
     <w:uiPriority w:val="30"/>
     <w:rsid w:val="00FC693F"/>
     <w:rPr>
+      <w:rFonts w:ascii="Arial Unicode MS" w:hAnsi="Arial Unicode MS" w:eastAsia="Arial Unicode MS"/>
       <w:b/>
       <w:bCs/>
       <w:i/>
@@ -1899,6 +2242,7 @@
     <w:qFormat/>
     <w:rsid w:val="00FC693F"/>
     <w:rPr>
+      <w:rFonts w:ascii="Arial Unicode MS" w:hAnsi="Arial Unicode MS" w:eastAsia="Arial Unicode MS"/>
       <w:i/>
       <w:iCs/>
       <w:color w:val="808080" w:themeColor="text1" w:themeTint="7F"/>
@@ -1911,6 +2255,7 @@
     <w:qFormat/>
     <w:rsid w:val="00FC693F"/>
     <w:rPr>
+      <w:rFonts w:ascii="Arial Unicode MS" w:hAnsi="Arial Unicode MS" w:eastAsia="Arial Unicode MS"/>
       <w:b/>
       <w:bCs/>
       <w:i/>
@@ -1925,6 +2270,7 @@
     <w:qFormat/>
     <w:rsid w:val="00FC693F"/>
     <w:rPr>
+      <w:rFonts w:ascii="Arial Unicode MS" w:hAnsi="Arial Unicode MS" w:eastAsia="Arial Unicode MS"/>
       <w:smallCaps/>
       <w:color w:val="C0504D" w:themeColor="accent2"/>
       <w:u w:val="single"/>
@@ -1937,6 +2283,7 @@
     <w:qFormat/>
     <w:rsid w:val="00FC693F"/>
     <w:rPr>
+      <w:rFonts w:ascii="Arial Unicode MS" w:hAnsi="Arial Unicode MS" w:eastAsia="Arial Unicode MS"/>
       <w:b/>
       <w:bCs/>
       <w:smallCaps/>
@@ -1952,6 +2299,7 @@
     <w:qFormat/>
     <w:rsid w:val="00FC693F"/>
     <w:rPr>
+      <w:rFonts w:ascii="Arial Unicode MS" w:hAnsi="Arial Unicode MS" w:eastAsia="Arial Unicode MS"/>
       <w:b/>
       <w:bCs/>
       <w:smallCaps/>
@@ -1970,6 +2318,9 @@
     <w:pPr>
       <w:outlineLvl w:val="9"/>
     </w:pPr>
+    <w:rPr>
+      <w:rFonts w:ascii="Arial Unicode MS" w:hAnsi="Arial Unicode MS" w:eastAsia="Arial Unicode MS"/>
+    </w:rPr>
   </w:style>
   <w:style w:type="table" w:styleId="TableGrid">
     <w:name w:val="Table Grid"/>
@@ -1979,6 +2330,9 @@
     <w:pPr>
       <w:spacing w:after="0" w:line="240" w:lineRule="auto"/>
     </w:pPr>
+    <w:rPr>
+      <w:rFonts w:ascii="Arial Unicode MS" w:hAnsi="Arial Unicode MS" w:eastAsia="Arial Unicode MS"/>
+    </w:rPr>
     <w:tblPr>
       <w:tblInd w:w="0" w:type="dxa"/>
       <w:tblBorders>
@@ -2006,6 +2360,7 @@
       <w:spacing w:after="0" w:line="240" w:lineRule="auto"/>
     </w:pPr>
     <w:rPr>
+      <w:rFonts w:ascii="Arial Unicode MS" w:hAnsi="Arial Unicode MS" w:eastAsia="Arial Unicode MS"/>
       <w:color w:val="000000" w:themeColor="text1" w:themeShade="BF"/>
     </w:rPr>
     <w:tblPr>
@@ -2109,6 +2464,7 @@
       <w:spacing w:after="0" w:line="240" w:lineRule="auto"/>
     </w:pPr>
     <w:rPr>
+      <w:rFonts w:ascii="Arial Unicode MS" w:hAnsi="Arial Unicode MS" w:eastAsia="Arial Unicode MS"/>
       <w:color w:val="365F91" w:themeColor="accent1" w:themeShade="BF"/>
     </w:rPr>
     <w:tblPr>
@@ -2212,6 +2568,7 @@
       <w:spacing w:after="0" w:line="240" w:lineRule="auto"/>
     </w:pPr>
     <w:rPr>
+      <w:rFonts w:ascii="Arial Unicode MS" w:hAnsi="Arial Unicode MS" w:eastAsia="Arial Unicode MS"/>
       <w:color w:val="943634" w:themeColor="accent2" w:themeShade="BF"/>
     </w:rPr>
     <w:tblPr>
@@ -2315,6 +2672,7 @@
       <w:spacing w:after="0" w:line="240" w:lineRule="auto"/>
     </w:pPr>
     <w:rPr>
+      <w:rFonts w:ascii="Arial Unicode MS" w:hAnsi="Arial Unicode MS" w:eastAsia="Arial Unicode MS"/>
       <w:color w:val="76923C" w:themeColor="accent3" w:themeShade="BF"/>
     </w:rPr>
     <w:tblPr>
@@ -2418,6 +2776,7 @@
       <w:spacing w:after="0" w:line="240" w:lineRule="auto"/>
     </w:pPr>
     <w:rPr>
+      <w:rFonts w:ascii="Arial Unicode MS" w:hAnsi="Arial Unicode MS" w:eastAsia="Arial Unicode MS"/>
       <w:color w:val="5F497A" w:themeColor="accent4" w:themeShade="BF"/>
     </w:rPr>
     <w:tblPr>
@@ -2521,6 +2880,7 @@
       <w:spacing w:after="0" w:line="240" w:lineRule="auto"/>
     </w:pPr>
     <w:rPr>
+      <w:rFonts w:ascii="Arial Unicode MS" w:hAnsi="Arial Unicode MS" w:eastAsia="Arial Unicode MS"/>
       <w:color w:val="31849B" w:themeColor="accent5" w:themeShade="BF"/>
     </w:rPr>
     <w:tblPr>
@@ -2624,6 +2984,7 @@
       <w:spacing w:after="0" w:line="240" w:lineRule="auto"/>
     </w:pPr>
     <w:rPr>
+      <w:rFonts w:ascii="Arial Unicode MS" w:hAnsi="Arial Unicode MS" w:eastAsia="Arial Unicode MS"/>
       <w:color w:val="E36C0A" w:themeColor="accent6" w:themeShade="BF"/>
     </w:rPr>
     <w:tblPr>
@@ -2726,6 +3087,9 @@
     <w:pPr>
       <w:spacing w:after="0" w:line="240" w:lineRule="auto"/>
     </w:pPr>
+    <w:rPr>
+      <w:rFonts w:ascii="Arial Unicode MS" w:hAnsi="Arial Unicode MS" w:eastAsia="Arial Unicode MS"/>
+    </w:rPr>
     <w:tblPr>
       <w:tblStyleRowBandSize w:val="1"/>
       <w:tblStyleColBandSize w:val="1"/>
@@ -2818,6 +3182,9 @@
     <w:pPr>
       <w:spacing w:after="0" w:line="240" w:lineRule="auto"/>
     </w:pPr>
+    <w:rPr>
+      <w:rFonts w:ascii="Arial Unicode MS" w:hAnsi="Arial Unicode MS" w:eastAsia="Arial Unicode MS"/>
+    </w:rPr>
     <w:tblPr>
       <w:tblStyleRowBandSize w:val="1"/>
       <w:tblStyleColBandSize w:val="1"/>
@@ -2910,6 +3277,9 @@
     <w:pPr>
       <w:spacing w:after="0" w:line="240" w:lineRule="auto"/>
     </w:pPr>
+    <w:rPr>
+      <w:rFonts w:ascii="Arial Unicode MS" w:hAnsi="Arial Unicode MS" w:eastAsia="Arial Unicode MS"/>
+    </w:rPr>
     <w:tblPr>
       <w:tblStyleRowBandSize w:val="1"/>
       <w:tblStyleColBandSize w:val="1"/>
@@ -3002,6 +3372,9 @@
     <w:pPr>
       <w:spacing w:after="0" w:line="240" w:lineRule="auto"/>
     </w:pPr>
+    <w:rPr>
+      <w:rFonts w:ascii="Arial Unicode MS" w:hAnsi="Arial Unicode MS" w:eastAsia="Arial Unicode MS"/>
+    </w:rPr>
     <w:tblPr>
       <w:tblStyleRowBandSize w:val="1"/>
       <w:tblStyleColBandSize w:val="1"/>
@@ -3094,6 +3467,9 @@
     <w:pPr>
       <w:spacing w:after="0" w:line="240" w:lineRule="auto"/>
     </w:pPr>
+    <w:rPr>
+      <w:rFonts w:ascii="Arial Unicode MS" w:hAnsi="Arial Unicode MS" w:eastAsia="Arial Unicode MS"/>
+    </w:rPr>
     <w:tblPr>
       <w:tblStyleRowBandSize w:val="1"/>
       <w:tblStyleColBandSize w:val="1"/>
@@ -3186,6 +3562,9 @@
     <w:pPr>
       <w:spacing w:after="0" w:line="240" w:lineRule="auto"/>
     </w:pPr>
+    <w:rPr>
+      <w:rFonts w:ascii="Arial Unicode MS" w:hAnsi="Arial Unicode MS" w:eastAsia="Arial Unicode MS"/>
+    </w:rPr>
     <w:tblPr>
       <w:tblStyleRowBandSize w:val="1"/>
       <w:tblStyleColBandSize w:val="1"/>
@@ -3278,6 +3657,9 @@
     <w:pPr>
       <w:spacing w:after="0" w:line="240" w:lineRule="auto"/>
     </w:pPr>
+    <w:rPr>
+      <w:rFonts w:ascii="Arial Unicode MS" w:hAnsi="Arial Unicode MS" w:eastAsia="Arial Unicode MS"/>
+    </w:rPr>
     <w:tblPr>
       <w:tblStyleRowBandSize w:val="1"/>
       <w:tblStyleColBandSize w:val="1"/>
@@ -3370,6 +3752,9 @@
     <w:pPr>
       <w:spacing w:after="0" w:line="240" w:lineRule="auto"/>
     </w:pPr>
+    <w:rPr>
+      <w:rFonts w:ascii="Arial Unicode MS" w:hAnsi="Arial Unicode MS" w:eastAsia="Arial Unicode MS"/>
+    </w:rPr>
     <w:tblPr>
       <w:tblStyleRowBandSize w:val="1"/>
       <w:tblStyleColBandSize w:val="1"/>
@@ -3500,6 +3885,9 @@
     <w:pPr>
       <w:spacing w:after="0" w:line="240" w:lineRule="auto"/>
     </w:pPr>
+    <w:rPr>
+      <w:rFonts w:ascii="Arial Unicode MS" w:hAnsi="Arial Unicode MS" w:eastAsia="Arial Unicode MS"/>
+    </w:rPr>
     <w:tblPr>
       <w:tblStyleRowBandSize w:val="1"/>
       <w:tblStyleColBandSize w:val="1"/>
@@ -3630,6 +4018,9 @@
     <w:pPr>
       <w:spacing w:after="0" w:line="240" w:lineRule="auto"/>
     </w:pPr>
+    <w:rPr>
+      <w:rFonts w:ascii="Arial Unicode MS" w:hAnsi="Arial Unicode MS" w:eastAsia="Arial Unicode MS"/>
+    </w:rPr>
     <w:tblPr>
       <w:tblStyleRowBandSize w:val="1"/>
       <w:tblStyleColBandSize w:val="1"/>
@@ -3760,6 +4151,9 @@
     <w:pPr>
       <w:spacing w:after="0" w:line="240" w:lineRule="auto"/>
     </w:pPr>
+    <w:rPr>
+      <w:rFonts w:ascii="Arial Unicode MS" w:hAnsi="Arial Unicode MS" w:eastAsia="Arial Unicode MS"/>
+    </w:rPr>
     <w:tblPr>
       <w:tblStyleRowBandSize w:val="1"/>
       <w:tblStyleColBandSize w:val="1"/>
@@ -3890,6 +4284,9 @@
     <w:pPr>
       <w:spacing w:after="0" w:line="240" w:lineRule="auto"/>
     </w:pPr>
+    <w:rPr>
+      <w:rFonts w:ascii="Arial Unicode MS" w:hAnsi="Arial Unicode MS" w:eastAsia="Arial Unicode MS"/>
+    </w:rPr>
     <w:tblPr>
       <w:tblStyleRowBandSize w:val="1"/>
       <w:tblStyleColBandSize w:val="1"/>
@@ -4020,6 +4417,9 @@
     <w:pPr>
       <w:spacing w:after="0" w:line="240" w:lineRule="auto"/>
     </w:pPr>
+    <w:rPr>
+      <w:rFonts w:ascii="Arial Unicode MS" w:hAnsi="Arial Unicode MS" w:eastAsia="Arial Unicode MS"/>
+    </w:rPr>
     <w:tblPr>
       <w:tblStyleRowBandSize w:val="1"/>
       <w:tblStyleColBandSize w:val="1"/>
@@ -4150,6 +4550,9 @@
     <w:pPr>
       <w:spacing w:after="0" w:line="240" w:lineRule="auto"/>
     </w:pPr>
+    <w:rPr>
+      <w:rFonts w:ascii="Arial Unicode MS" w:hAnsi="Arial Unicode MS" w:eastAsia="Arial Unicode MS"/>
+    </w:rPr>
     <w:tblPr>
       <w:tblStyleRowBandSize w:val="1"/>
       <w:tblStyleColBandSize w:val="1"/>
@@ -4280,6 +4683,9 @@
     <w:pPr>
       <w:spacing w:after="0" w:line="240" w:lineRule="auto"/>
     </w:pPr>
+    <w:rPr>
+      <w:rFonts w:ascii="Arial Unicode MS" w:hAnsi="Arial Unicode MS" w:eastAsia="Arial Unicode MS"/>
+    </w:rPr>
     <w:tblPr>
       <w:tblStyleRowBandSize w:val="1"/>
       <w:tblStyleColBandSize w:val="1"/>
@@ -4386,6 +4792,9 @@
     <w:pPr>
       <w:spacing w:after="0" w:line="240" w:lineRule="auto"/>
     </w:pPr>
+    <w:rPr>
+      <w:rFonts w:ascii="Arial Unicode MS" w:hAnsi="Arial Unicode MS" w:eastAsia="Arial Unicode MS"/>
+    </w:rPr>
     <w:tblPr>
       <w:tblStyleRowBandSize w:val="1"/>
       <w:tblStyleColBandSize w:val="1"/>
@@ -4492,6 +4901,9 @@
     <w:pPr>
       <w:spacing w:after="0" w:line="240" w:lineRule="auto"/>
     </w:pPr>
+    <w:rPr>
+      <w:rFonts w:ascii="Arial Unicode MS" w:hAnsi="Arial Unicode MS" w:eastAsia="Arial Unicode MS"/>
+    </w:rPr>
     <w:tblPr>
       <w:tblStyleRowBandSize w:val="1"/>
       <w:tblStyleColBandSize w:val="1"/>
@@ -4598,6 +5010,9 @@
     <w:pPr>
       <w:spacing w:after="0" w:line="240" w:lineRule="auto"/>
     </w:pPr>
+    <w:rPr>
+      <w:rFonts w:ascii="Arial Unicode MS" w:hAnsi="Arial Unicode MS" w:eastAsia="Arial Unicode MS"/>
+    </w:rPr>
     <w:tblPr>
       <w:tblStyleRowBandSize w:val="1"/>
       <w:tblStyleColBandSize w:val="1"/>
@@ -4704,6 +5119,9 @@
     <w:pPr>
       <w:spacing w:after="0" w:line="240" w:lineRule="auto"/>
     </w:pPr>
+    <w:rPr>
+      <w:rFonts w:ascii="Arial Unicode MS" w:hAnsi="Arial Unicode MS" w:eastAsia="Arial Unicode MS"/>
+    </w:rPr>
     <w:tblPr>
       <w:tblStyleRowBandSize w:val="1"/>
       <w:tblStyleColBandSize w:val="1"/>
@@ -4810,6 +5228,9 @@
     <w:pPr>
       <w:spacing w:after="0" w:line="240" w:lineRule="auto"/>
     </w:pPr>
+    <w:rPr>
+      <w:rFonts w:ascii="Arial Unicode MS" w:hAnsi="Arial Unicode MS" w:eastAsia="Arial Unicode MS"/>
+    </w:rPr>
     <w:tblPr>
       <w:tblStyleRowBandSize w:val="1"/>
       <w:tblStyleColBandSize w:val="1"/>
@@ -4916,6 +5337,9 @@
     <w:pPr>
       <w:spacing w:after="0" w:line="240" w:lineRule="auto"/>
     </w:pPr>
+    <w:rPr>
+      <w:rFonts w:ascii="Arial Unicode MS" w:hAnsi="Arial Unicode MS" w:eastAsia="Arial Unicode MS"/>
+    </w:rPr>
     <w:tblPr>
       <w:tblStyleRowBandSize w:val="1"/>
       <w:tblStyleColBandSize w:val="1"/>
@@ -5022,6 +5446,9 @@
     <w:pPr>
       <w:spacing w:after="0" w:line="240" w:lineRule="auto"/>
     </w:pPr>
+    <w:rPr>
+      <w:rFonts w:ascii="Arial Unicode MS" w:hAnsi="Arial Unicode MS" w:eastAsia="Arial Unicode MS"/>
+    </w:rPr>
     <w:tblPr>
       <w:tblStyleRowBandSize w:val="1"/>
       <w:tblStyleColBandSize w:val="1"/>
@@ -5171,6 +5598,9 @@
     <w:pPr>
       <w:spacing w:after="0" w:line="240" w:lineRule="auto"/>
     </w:pPr>
+    <w:rPr>
+      <w:rFonts w:ascii="Arial Unicode MS" w:hAnsi="Arial Unicode MS" w:eastAsia="Arial Unicode MS"/>
+    </w:rPr>
     <w:tblPr>
       <w:tblStyleRowBandSize w:val="1"/>
       <w:tblStyleColBandSize w:val="1"/>
@@ -5320,6 +5750,9 @@
     <w:pPr>
       <w:spacing w:after="0" w:line="240" w:lineRule="auto"/>
     </w:pPr>
+    <w:rPr>
+      <w:rFonts w:ascii="Arial Unicode MS" w:hAnsi="Arial Unicode MS" w:eastAsia="Arial Unicode MS"/>
+    </w:rPr>
     <w:tblPr>
       <w:tblStyleRowBandSize w:val="1"/>
       <w:tblStyleColBandSize w:val="1"/>
@@ -5469,6 +5902,9 @@
     <w:pPr>
       <w:spacing w:after="0" w:line="240" w:lineRule="auto"/>
     </w:pPr>
+    <w:rPr>
+      <w:rFonts w:ascii="Arial Unicode MS" w:hAnsi="Arial Unicode MS" w:eastAsia="Arial Unicode MS"/>
+    </w:rPr>
     <w:tblPr>
       <w:tblStyleRowBandSize w:val="1"/>
       <w:tblStyleColBandSize w:val="1"/>
@@ -5618,6 +6054,9 @@
     <w:pPr>
       <w:spacing w:after="0" w:line="240" w:lineRule="auto"/>
     </w:pPr>
+    <w:rPr>
+      <w:rFonts w:ascii="Arial Unicode MS" w:hAnsi="Arial Unicode MS" w:eastAsia="Arial Unicode MS"/>
+    </w:rPr>
     <w:tblPr>
       <w:tblStyleRowBandSize w:val="1"/>
       <w:tblStyleColBandSize w:val="1"/>
@@ -5767,6 +6206,9 @@
     <w:pPr>
       <w:spacing w:after="0" w:line="240" w:lineRule="auto"/>
     </w:pPr>
+    <w:rPr>
+      <w:rFonts w:ascii="Arial Unicode MS" w:hAnsi="Arial Unicode MS" w:eastAsia="Arial Unicode MS"/>
+    </w:rPr>
     <w:tblPr>
       <w:tblStyleRowBandSize w:val="1"/>
       <w:tblStyleColBandSize w:val="1"/>
@@ -5916,6 +6358,9 @@
     <w:pPr>
       <w:spacing w:after="0" w:line="240" w:lineRule="auto"/>
     </w:pPr>
+    <w:rPr>
+      <w:rFonts w:ascii="Arial Unicode MS" w:hAnsi="Arial Unicode MS" w:eastAsia="Arial Unicode MS"/>
+    </w:rPr>
     <w:tblPr>
       <w:tblStyleRowBandSize w:val="1"/>
       <w:tblStyleColBandSize w:val="1"/>
@@ -6066,6 +6511,7 @@
       <w:spacing w:after="0" w:line="240" w:lineRule="auto"/>
     </w:pPr>
     <w:rPr>
+      <w:rFonts w:ascii="Arial Unicode MS" w:hAnsi="Arial Unicode MS" w:eastAsia="Arial Unicode MS"/>
       <w:color w:val="000000" w:themeColor="text1"/>
     </w:rPr>
     <w:tblPr>
@@ -6150,6 +6596,7 @@
       <w:spacing w:after="0" w:line="240" w:lineRule="auto"/>
     </w:pPr>
     <w:rPr>
+      <w:rFonts w:ascii="Arial Unicode MS" w:hAnsi="Arial Unicode MS" w:eastAsia="Arial Unicode MS"/>
       <w:color w:val="000000" w:themeColor="text1"/>
     </w:rPr>
     <w:tblPr>
@@ -6234,6 +6681,7 @@
       <w:spacing w:after="0" w:line="240" w:lineRule="auto"/>
     </w:pPr>
     <w:rPr>
+      <w:rFonts w:ascii="Arial Unicode MS" w:hAnsi="Arial Unicode MS" w:eastAsia="Arial Unicode MS"/>
       <w:color w:val="000000" w:themeColor="text1"/>
     </w:rPr>
     <w:tblPr>
@@ -6318,6 +6766,7 @@
       <w:spacing w:after="0" w:line="240" w:lineRule="auto"/>
     </w:pPr>
     <w:rPr>
+      <w:rFonts w:ascii="Arial Unicode MS" w:hAnsi="Arial Unicode MS" w:eastAsia="Arial Unicode MS"/>
       <w:color w:val="000000" w:themeColor="text1"/>
     </w:rPr>
     <w:tblPr>
@@ -6402,6 +6851,7 @@
       <w:spacing w:after="0" w:line="240" w:lineRule="auto"/>
     </w:pPr>
     <w:rPr>
+      <w:rFonts w:ascii="Arial Unicode MS" w:hAnsi="Arial Unicode MS" w:eastAsia="Arial Unicode MS"/>
       <w:color w:val="000000" w:themeColor="text1"/>
     </w:rPr>
     <w:tblPr>
@@ -6486,6 +6936,7 @@
       <w:spacing w:after="0" w:line="240" w:lineRule="auto"/>
     </w:pPr>
     <w:rPr>
+      <w:rFonts w:ascii="Arial Unicode MS" w:hAnsi="Arial Unicode MS" w:eastAsia="Arial Unicode MS"/>
       <w:color w:val="000000" w:themeColor="text1"/>
     </w:rPr>
     <w:tblPr>
@@ -6570,6 +7021,7 @@
       <w:spacing w:after="0" w:line="240" w:lineRule="auto"/>
     </w:pPr>
     <w:rPr>
+      <w:rFonts w:ascii="Arial Unicode MS" w:hAnsi="Arial Unicode MS" w:eastAsia="Arial Unicode MS"/>
       <w:color w:val="000000" w:themeColor="text1"/>
     </w:rPr>
     <w:tblPr>
@@ -6654,7 +7106,7 @@
       <w:spacing w:after="0" w:line="240" w:lineRule="auto"/>
     </w:pPr>
     <w:rPr>
-      <w:rFonts w:asciiTheme="majorHAnsi" w:eastAsiaTheme="majorEastAsia" w:hAnsiTheme="majorHAnsi" w:cstheme="majorBidi"/>
+      <w:rFonts w:asciiTheme="majorHAnsi" w:eastAsiaTheme="majorEastAsia" w:hAnsiTheme="majorHAnsi" w:cstheme="majorBidi" w:ascii="Arial Unicode MS" w:hAnsi="Arial Unicode MS" w:eastAsia="Arial Unicode MS"/>
       <w:color w:val="000000" w:themeColor="text1"/>
     </w:rPr>
     <w:tblPr>
@@ -6782,7 +7234,7 @@
       <w:spacing w:after="0" w:line="240" w:lineRule="auto"/>
     </w:pPr>
     <w:rPr>
-      <w:rFonts w:asciiTheme="majorHAnsi" w:eastAsiaTheme="majorEastAsia" w:hAnsiTheme="majorHAnsi" w:cstheme="majorBidi"/>
+      <w:rFonts w:asciiTheme="majorHAnsi" w:eastAsiaTheme="majorEastAsia" w:hAnsiTheme="majorHAnsi" w:cstheme="majorBidi" w:ascii="Arial Unicode MS" w:hAnsi="Arial Unicode MS" w:eastAsia="Arial Unicode MS"/>
       <w:color w:val="000000" w:themeColor="text1"/>
     </w:rPr>
     <w:tblPr>
@@ -6910,7 +7362,7 @@
       <w:spacing w:after="0" w:line="240" w:lineRule="auto"/>
     </w:pPr>
     <w:rPr>
-      <w:rFonts w:asciiTheme="majorHAnsi" w:eastAsiaTheme="majorEastAsia" w:hAnsiTheme="majorHAnsi" w:cstheme="majorBidi"/>
+      <w:rFonts w:asciiTheme="majorHAnsi" w:eastAsiaTheme="majorEastAsia" w:hAnsiTheme="majorHAnsi" w:cstheme="majorBidi" w:ascii="Arial Unicode MS" w:hAnsi="Arial Unicode MS" w:eastAsia="Arial Unicode MS"/>
       <w:color w:val="000000" w:themeColor="text1"/>
     </w:rPr>
     <w:tblPr>
@@ -7038,7 +7490,7 @@
       <w:spacing w:after="0" w:line="240" w:lineRule="auto"/>
     </w:pPr>
     <w:rPr>
-      <w:rFonts w:asciiTheme="majorHAnsi" w:eastAsiaTheme="majorEastAsia" w:hAnsiTheme="majorHAnsi" w:cstheme="majorBidi"/>
+      <w:rFonts w:asciiTheme="majorHAnsi" w:eastAsiaTheme="majorEastAsia" w:hAnsiTheme="majorHAnsi" w:cstheme="majorBidi" w:ascii="Arial Unicode MS" w:hAnsi="Arial Unicode MS" w:eastAsia="Arial Unicode MS"/>
       <w:color w:val="000000" w:themeColor="text1"/>
     </w:rPr>
     <w:tblPr>
@@ -7166,7 +7618,7 @@
       <w:spacing w:after="0" w:line="240" w:lineRule="auto"/>
     </w:pPr>
     <w:rPr>
-      <w:rFonts w:asciiTheme="majorHAnsi" w:eastAsiaTheme="majorEastAsia" w:hAnsiTheme="majorHAnsi" w:cstheme="majorBidi"/>
+      <w:rFonts w:asciiTheme="majorHAnsi" w:eastAsiaTheme="majorEastAsia" w:hAnsiTheme="majorHAnsi" w:cstheme="majorBidi" w:ascii="Arial Unicode MS" w:hAnsi="Arial Unicode MS" w:eastAsia="Arial Unicode MS"/>
       <w:color w:val="000000" w:themeColor="text1"/>
     </w:rPr>
     <w:tblPr>
@@ -7294,7 +7746,7 @@
       <w:spacing w:after="0" w:line="240" w:lineRule="auto"/>
     </w:pPr>
     <w:rPr>
-      <w:rFonts w:asciiTheme="majorHAnsi" w:eastAsiaTheme="majorEastAsia" w:hAnsiTheme="majorHAnsi" w:cstheme="majorBidi"/>
+      <w:rFonts w:asciiTheme="majorHAnsi" w:eastAsiaTheme="majorEastAsia" w:hAnsiTheme="majorHAnsi" w:cstheme="majorBidi" w:ascii="Arial Unicode MS" w:hAnsi="Arial Unicode MS" w:eastAsia="Arial Unicode MS"/>
       <w:color w:val="000000" w:themeColor="text1"/>
     </w:rPr>
     <w:tblPr>
@@ -7422,7 +7874,7 @@
       <w:spacing w:after="0" w:line="240" w:lineRule="auto"/>
     </w:pPr>
     <w:rPr>
-      <w:rFonts w:asciiTheme="majorHAnsi" w:eastAsiaTheme="majorEastAsia" w:hAnsiTheme="majorHAnsi" w:cstheme="majorBidi"/>
+      <w:rFonts w:asciiTheme="majorHAnsi" w:eastAsiaTheme="majorEastAsia" w:hAnsiTheme="majorHAnsi" w:cstheme="majorBidi" w:ascii="Arial Unicode MS" w:hAnsi="Arial Unicode MS" w:eastAsia="Arial Unicode MS"/>
       <w:color w:val="000000" w:themeColor="text1"/>
     </w:rPr>
     <w:tblPr>
@@ -7549,6 +8001,9 @@
     <w:pPr>
       <w:spacing w:after="0" w:line="240" w:lineRule="auto"/>
     </w:pPr>
+    <w:rPr>
+      <w:rFonts w:ascii="Arial Unicode MS" w:hAnsi="Arial Unicode MS" w:eastAsia="Arial Unicode MS"/>
+    </w:rPr>
     <w:tblPr>
       <w:tblStyleRowBandSize w:val="1"/>
       <w:tblStyleColBandSize w:val="1"/>
@@ -7622,6 +8077,9 @@
     <w:pPr>
       <w:spacing w:after="0" w:line="240" w:lineRule="auto"/>
     </w:pPr>
+    <w:rPr>
+      <w:rFonts w:ascii="Arial Unicode MS" w:hAnsi="Arial Unicode MS" w:eastAsia="Arial Unicode MS"/>
+    </w:rPr>
     <w:tblPr>
       <w:tblStyleRowBandSize w:val="1"/>
       <w:tblStyleColBandSize w:val="1"/>
@@ -7695,6 +8153,9 @@
     <w:pPr>
       <w:spacing w:after="0" w:line="240" w:lineRule="auto"/>
     </w:pPr>
+    <w:rPr>
+      <w:rFonts w:ascii="Arial Unicode MS" w:hAnsi="Arial Unicode MS" w:eastAsia="Arial Unicode MS"/>
+    </w:rPr>
     <w:tblPr>
       <w:tblStyleRowBandSize w:val="1"/>
       <w:tblStyleColBandSize w:val="1"/>
@@ -7768,6 +8229,9 @@
     <w:pPr>
       <w:spacing w:after="0" w:line="240" w:lineRule="auto"/>
     </w:pPr>
+    <w:rPr>
+      <w:rFonts w:ascii="Arial Unicode MS" w:hAnsi="Arial Unicode MS" w:eastAsia="Arial Unicode MS"/>
+    </w:rPr>
     <w:tblPr>
       <w:tblStyleRowBandSize w:val="1"/>
       <w:tblStyleColBandSize w:val="1"/>
@@ -7841,6 +8305,9 @@
     <w:pPr>
       <w:spacing w:after="0" w:line="240" w:lineRule="auto"/>
     </w:pPr>
+    <w:rPr>
+      <w:rFonts w:ascii="Arial Unicode MS" w:hAnsi="Arial Unicode MS" w:eastAsia="Arial Unicode MS"/>
+    </w:rPr>
     <w:tblPr>
       <w:tblStyleRowBandSize w:val="1"/>
       <w:tblStyleColBandSize w:val="1"/>
@@ -7914,6 +8381,9 @@
     <w:pPr>
       <w:spacing w:after="0" w:line="240" w:lineRule="auto"/>
     </w:pPr>
+    <w:rPr>
+      <w:rFonts w:ascii="Arial Unicode MS" w:hAnsi="Arial Unicode MS" w:eastAsia="Arial Unicode MS"/>
+    </w:rPr>
     <w:tblPr>
       <w:tblStyleRowBandSize w:val="1"/>
       <w:tblStyleColBandSize w:val="1"/>
@@ -7987,6 +8457,9 @@
     <w:pPr>
       <w:spacing w:after="0" w:line="240" w:lineRule="auto"/>
     </w:pPr>
+    <w:rPr>
+      <w:rFonts w:ascii="Arial Unicode MS" w:hAnsi="Arial Unicode MS" w:eastAsia="Arial Unicode MS"/>
+    </w:rPr>
     <w:tblPr>
       <w:tblStyleRowBandSize w:val="1"/>
       <w:tblStyleColBandSize w:val="1"/>
@@ -8061,7 +8534,7 @@
       <w:spacing w:after="0" w:line="240" w:lineRule="auto"/>
     </w:pPr>
     <w:rPr>
-      <w:rFonts w:asciiTheme="majorHAnsi" w:eastAsiaTheme="majorEastAsia" w:hAnsiTheme="majorHAnsi" w:cstheme="majorBidi"/>
+      <w:rFonts w:asciiTheme="majorHAnsi" w:eastAsiaTheme="majorEastAsia" w:hAnsiTheme="majorHAnsi" w:cstheme="majorBidi" w:ascii="Arial Unicode MS" w:hAnsi="Arial Unicode MS" w:eastAsia="Arial Unicode MS"/>
       <w:color w:val="000000" w:themeColor="text1"/>
     </w:rPr>
     <w:tblPr>
@@ -8186,7 +8659,7 @@
       <w:spacing w:after="0" w:line="240" w:lineRule="auto"/>
     </w:pPr>
     <w:rPr>
-      <w:rFonts w:asciiTheme="majorHAnsi" w:eastAsiaTheme="majorEastAsia" w:hAnsiTheme="majorHAnsi" w:cstheme="majorBidi"/>
+      <w:rFonts w:asciiTheme="majorHAnsi" w:eastAsiaTheme="majorEastAsia" w:hAnsiTheme="majorHAnsi" w:cstheme="majorBidi" w:ascii="Arial Unicode MS" w:hAnsi="Arial Unicode MS" w:eastAsia="Arial Unicode MS"/>
       <w:color w:val="000000" w:themeColor="text1"/>
     </w:rPr>
     <w:tblPr>
@@ -8311,7 +8784,7 @@
       <w:spacing w:after="0" w:line="240" w:lineRule="auto"/>
     </w:pPr>
     <w:rPr>
-      <w:rFonts w:asciiTheme="majorHAnsi" w:eastAsiaTheme="majorEastAsia" w:hAnsiTheme="majorHAnsi" w:cstheme="majorBidi"/>
+      <w:rFonts w:asciiTheme="majorHAnsi" w:eastAsiaTheme="majorEastAsia" w:hAnsiTheme="majorHAnsi" w:cstheme="majorBidi" w:ascii="Arial Unicode MS" w:hAnsi="Arial Unicode MS" w:eastAsia="Arial Unicode MS"/>
       <w:color w:val="000000" w:themeColor="text1"/>
     </w:rPr>
     <w:tblPr>
@@ -8436,7 +8909,7 @@
       <w:spacing w:after="0" w:line="240" w:lineRule="auto"/>
     </w:pPr>
     <w:rPr>
-      <w:rFonts w:asciiTheme="majorHAnsi" w:eastAsiaTheme="majorEastAsia" w:hAnsiTheme="majorHAnsi" w:cstheme="majorBidi"/>
+      <w:rFonts w:asciiTheme="majorHAnsi" w:eastAsiaTheme="majorEastAsia" w:hAnsiTheme="majorHAnsi" w:cstheme="majorBidi" w:ascii="Arial Unicode MS" w:hAnsi="Arial Unicode MS" w:eastAsia="Arial Unicode MS"/>
       <w:color w:val="000000" w:themeColor="text1"/>
     </w:rPr>
     <w:tblPr>
@@ -8561,7 +9034,7 @@
       <w:spacing w:after="0" w:line="240" w:lineRule="auto"/>
     </w:pPr>
     <w:rPr>
-      <w:rFonts w:asciiTheme="majorHAnsi" w:eastAsiaTheme="majorEastAsia" w:hAnsiTheme="majorHAnsi" w:cstheme="majorBidi"/>
+      <w:rFonts w:asciiTheme="majorHAnsi" w:eastAsiaTheme="majorEastAsia" w:hAnsiTheme="majorHAnsi" w:cstheme="majorBidi" w:ascii="Arial Unicode MS" w:hAnsi="Arial Unicode MS" w:eastAsia="Arial Unicode MS"/>
       <w:color w:val="000000" w:themeColor="text1"/>
     </w:rPr>
     <w:tblPr>
@@ -8686,7 +9159,7 @@
       <w:spacing w:after="0" w:line="240" w:lineRule="auto"/>
     </w:pPr>
     <w:rPr>
-      <w:rFonts w:asciiTheme="majorHAnsi" w:eastAsiaTheme="majorEastAsia" w:hAnsiTheme="majorHAnsi" w:cstheme="majorBidi"/>
+      <w:rFonts w:asciiTheme="majorHAnsi" w:eastAsiaTheme="majorEastAsia" w:hAnsiTheme="majorHAnsi" w:cstheme="majorBidi" w:ascii="Arial Unicode MS" w:hAnsi="Arial Unicode MS" w:eastAsia="Arial Unicode MS"/>
       <w:color w:val="000000" w:themeColor="text1"/>
     </w:rPr>
     <w:tblPr>
@@ -8811,7 +9284,7 @@
       <w:spacing w:after="0" w:line="240" w:lineRule="auto"/>
     </w:pPr>
     <w:rPr>
-      <w:rFonts w:asciiTheme="majorHAnsi" w:eastAsiaTheme="majorEastAsia" w:hAnsiTheme="majorHAnsi" w:cstheme="majorBidi"/>
+      <w:rFonts w:asciiTheme="majorHAnsi" w:eastAsiaTheme="majorEastAsia" w:hAnsiTheme="majorHAnsi" w:cstheme="majorBidi" w:ascii="Arial Unicode MS" w:hAnsi="Arial Unicode MS" w:eastAsia="Arial Unicode MS"/>
       <w:color w:val="000000" w:themeColor="text1"/>
     </w:rPr>
     <w:tblPr>
@@ -8935,6 +9408,9 @@
     <w:pPr>
       <w:spacing w:after="0" w:line="240" w:lineRule="auto"/>
     </w:pPr>
+    <w:rPr>
+      <w:rFonts w:ascii="Arial Unicode MS" w:hAnsi="Arial Unicode MS" w:eastAsia="Arial Unicode MS"/>
+    </w:rPr>
     <w:tblPr>
       <w:tblStyleRowBandSize w:val="1"/>
       <w:tblStyleColBandSize w:val="1"/>
@@ -9076,6 +9552,9 @@
     <w:pPr>
       <w:spacing w:after="0" w:line="240" w:lineRule="auto"/>
     </w:pPr>
+    <w:rPr>
+      <w:rFonts w:ascii="Arial Unicode MS" w:hAnsi="Arial Unicode MS" w:eastAsia="Arial Unicode MS"/>
+    </w:rPr>
     <w:tblPr>
       <w:tblStyleRowBandSize w:val="1"/>
       <w:tblStyleColBandSize w:val="1"/>
@@ -9217,6 +9696,9 @@
     <w:pPr>
       <w:spacing w:after="0" w:line="240" w:lineRule="auto"/>
     </w:pPr>
+    <w:rPr>
+      <w:rFonts w:ascii="Arial Unicode MS" w:hAnsi="Arial Unicode MS" w:eastAsia="Arial Unicode MS"/>
+    </w:rPr>
     <w:tblPr>
       <w:tblStyleRowBandSize w:val="1"/>
       <w:tblStyleColBandSize w:val="1"/>
@@ -9358,6 +9840,9 @@
     <w:pPr>
       <w:spacing w:after="0" w:line="240" w:lineRule="auto"/>
     </w:pPr>
+    <w:rPr>
+      <w:rFonts w:ascii="Arial Unicode MS" w:hAnsi="Arial Unicode MS" w:eastAsia="Arial Unicode MS"/>
+    </w:rPr>
     <w:tblPr>
       <w:tblStyleRowBandSize w:val="1"/>
       <w:tblStyleColBandSize w:val="1"/>
@@ -9499,6 +9984,9 @@
     <w:pPr>
       <w:spacing w:after="0" w:line="240" w:lineRule="auto"/>
     </w:pPr>
+    <w:rPr>
+      <w:rFonts w:ascii="Arial Unicode MS" w:hAnsi="Arial Unicode MS" w:eastAsia="Arial Unicode MS"/>
+    </w:rPr>
     <w:tblPr>
       <w:tblStyleRowBandSize w:val="1"/>
       <w:tblStyleColBandSize w:val="1"/>
@@ -9640,6 +10128,9 @@
     <w:pPr>
       <w:spacing w:after="0" w:line="240" w:lineRule="auto"/>
     </w:pPr>
+    <w:rPr>
+      <w:rFonts w:ascii="Arial Unicode MS" w:hAnsi="Arial Unicode MS" w:eastAsia="Arial Unicode MS"/>
+    </w:rPr>
     <w:tblPr>
       <w:tblStyleRowBandSize w:val="1"/>
       <w:tblStyleColBandSize w:val="1"/>
@@ -9781,6 +10272,9 @@
     <w:pPr>
       <w:spacing w:after="0" w:line="240" w:lineRule="auto"/>
     </w:pPr>
+    <w:rPr>
+      <w:rFonts w:ascii="Arial Unicode MS" w:hAnsi="Arial Unicode MS" w:eastAsia="Arial Unicode MS"/>
+    </w:rPr>
     <w:tblPr>
       <w:tblStyleRowBandSize w:val="1"/>
       <w:tblStyleColBandSize w:val="1"/>
@@ -9923,6 +10417,7 @@
       <w:spacing w:after="0" w:line="240" w:lineRule="auto"/>
     </w:pPr>
     <w:rPr>
+      <w:rFonts w:ascii="Arial Unicode MS" w:hAnsi="Arial Unicode MS" w:eastAsia="Arial Unicode MS"/>
       <w:color w:val="FFFFFF" w:themeColor="background1"/>
     </w:rPr>
     <w:tblPr>
@@ -10037,6 +10532,7 @@
       <w:spacing w:after="0" w:line="240" w:lineRule="auto"/>
     </w:pPr>
     <w:rPr>
+      <w:rFonts w:ascii="Arial Unicode MS" w:hAnsi="Arial Unicode MS" w:eastAsia="Arial Unicode MS"/>
       <w:color w:val="FFFFFF" w:themeColor="background1"/>
     </w:rPr>
     <w:tblPr>
@@ -10151,6 +10647,7 @@
       <w:spacing w:after="0" w:line="240" w:lineRule="auto"/>
     </w:pPr>
     <w:rPr>
+      <w:rFonts w:ascii="Arial Unicode MS" w:hAnsi="Arial Unicode MS" w:eastAsia="Arial Unicode MS"/>
       <w:color w:val="FFFFFF" w:themeColor="background1"/>
     </w:rPr>
     <w:tblPr>
@@ -10265,6 +10762,7 @@
       <w:spacing w:after="0" w:line="240" w:lineRule="auto"/>
     </w:pPr>
     <w:rPr>
+      <w:rFonts w:ascii="Arial Unicode MS" w:hAnsi="Arial Unicode MS" w:eastAsia="Arial Unicode MS"/>
       <w:color w:val="FFFFFF" w:themeColor="background1"/>
     </w:rPr>
     <w:tblPr>
@@ -10379,6 +10877,7 @@
       <w:spacing w:after="0" w:line="240" w:lineRule="auto"/>
     </w:pPr>
     <w:rPr>
+      <w:rFonts w:ascii="Arial Unicode MS" w:hAnsi="Arial Unicode MS" w:eastAsia="Arial Unicode MS"/>
       <w:color w:val="FFFFFF" w:themeColor="background1"/>
     </w:rPr>
     <w:tblPr>
@@ -10493,6 +10992,7 @@
       <w:spacing w:after="0" w:line="240" w:lineRule="auto"/>
     </w:pPr>
     <w:rPr>
+      <w:rFonts w:ascii="Arial Unicode MS" w:hAnsi="Arial Unicode MS" w:eastAsia="Arial Unicode MS"/>
       <w:color w:val="FFFFFF" w:themeColor="background1"/>
     </w:rPr>
     <w:tblPr>
@@ -10607,6 +11107,7 @@
       <w:spacing w:after="0" w:line="240" w:lineRule="auto"/>
     </w:pPr>
     <w:rPr>
+      <w:rFonts w:ascii="Arial Unicode MS" w:hAnsi="Arial Unicode MS" w:eastAsia="Arial Unicode MS"/>
       <w:color w:val="FFFFFF" w:themeColor="background1"/>
     </w:rPr>
     <w:tblPr>
@@ -10721,6 +11222,7 @@
       <w:spacing w:after="0" w:line="240" w:lineRule="auto"/>
     </w:pPr>
     <w:rPr>
+      <w:rFonts w:ascii="Arial Unicode MS" w:hAnsi="Arial Unicode MS" w:eastAsia="Arial Unicode MS"/>
       <w:color w:val="000000" w:themeColor="text1"/>
     </w:rPr>
     <w:tblPr>
@@ -10843,6 +11345,7 @@
       <w:spacing w:after="0" w:line="240" w:lineRule="auto"/>
     </w:pPr>
     <w:rPr>
+      <w:rFonts w:ascii="Arial Unicode MS" w:hAnsi="Arial Unicode MS" w:eastAsia="Arial Unicode MS"/>
       <w:color w:val="000000" w:themeColor="text1"/>
     </w:rPr>
     <w:tblPr>
@@ -10965,6 +11468,7 @@
       <w:spacing w:after="0" w:line="240" w:lineRule="auto"/>
     </w:pPr>
     <w:rPr>
+      <w:rFonts w:ascii="Arial Unicode MS" w:hAnsi="Arial Unicode MS" w:eastAsia="Arial Unicode MS"/>
       <w:color w:val="000000" w:themeColor="text1"/>
     </w:rPr>
     <w:tblPr>
@@ -11087,6 +11591,7 @@
       <w:spacing w:after="0" w:line="240" w:lineRule="auto"/>
     </w:pPr>
     <w:rPr>
+      <w:rFonts w:ascii="Arial Unicode MS" w:hAnsi="Arial Unicode MS" w:eastAsia="Arial Unicode MS"/>
       <w:color w:val="000000" w:themeColor="text1"/>
     </w:rPr>
     <w:tblPr>
@@ -11199,6 +11704,7 @@
       <w:spacing w:after="0" w:line="240" w:lineRule="auto"/>
     </w:pPr>
     <w:rPr>
+      <w:rFonts w:ascii="Arial Unicode MS" w:hAnsi="Arial Unicode MS" w:eastAsia="Arial Unicode MS"/>
       <w:color w:val="000000" w:themeColor="text1"/>
     </w:rPr>
     <w:tblPr>
@@ -11321,6 +11827,7 @@
       <w:spacing w:after="0" w:line="240" w:lineRule="auto"/>
     </w:pPr>
     <w:rPr>
+      <w:rFonts w:ascii="Arial Unicode MS" w:hAnsi="Arial Unicode MS" w:eastAsia="Arial Unicode MS"/>
       <w:color w:val="000000" w:themeColor="text1"/>
     </w:rPr>
     <w:tblPr>
@@ -11443,6 +11950,7 @@
       <w:spacing w:after="0" w:line="240" w:lineRule="auto"/>
     </w:pPr>
     <w:rPr>
+      <w:rFonts w:ascii="Arial Unicode MS" w:hAnsi="Arial Unicode MS" w:eastAsia="Arial Unicode MS"/>
       <w:color w:val="000000" w:themeColor="text1"/>
     </w:rPr>
     <w:tblPr>
@@ -11565,6 +12073,7 @@
       <w:spacing w:after="0" w:line="240" w:lineRule="auto"/>
     </w:pPr>
     <w:rPr>
+      <w:rFonts w:ascii="Arial Unicode MS" w:hAnsi="Arial Unicode MS" w:eastAsia="Arial Unicode MS"/>
       <w:color w:val="000000" w:themeColor="text1"/>
     </w:rPr>
     <w:tblPr>
@@ -11651,6 +12160,7 @@
       <w:spacing w:after="0" w:line="240" w:lineRule="auto"/>
     </w:pPr>
     <w:rPr>
+      <w:rFonts w:ascii="Arial Unicode MS" w:hAnsi="Arial Unicode MS" w:eastAsia="Arial Unicode MS"/>
       <w:color w:val="000000" w:themeColor="text1"/>
     </w:rPr>
     <w:tblPr>
@@ -11737,6 +12247,7 @@
       <w:spacing w:after="0" w:line="240" w:lineRule="auto"/>
     </w:pPr>
     <w:rPr>
+      <w:rFonts w:ascii="Arial Unicode MS" w:hAnsi="Arial Unicode MS" w:eastAsia="Arial Unicode MS"/>
       <w:color w:val="000000" w:themeColor="text1"/>
     </w:rPr>
     <w:tblPr>
@@ -11823,6 +12334,7 @@
       <w:spacing w:after="0" w:line="240" w:lineRule="auto"/>
     </w:pPr>
     <w:rPr>
+      <w:rFonts w:ascii="Arial Unicode MS" w:hAnsi="Arial Unicode MS" w:eastAsia="Arial Unicode MS"/>
       <w:color w:val="000000" w:themeColor="text1"/>
     </w:rPr>
     <w:tblPr>
@@ -11909,6 +12421,7 @@
       <w:spacing w:after="0" w:line="240" w:lineRule="auto"/>
     </w:pPr>
     <w:rPr>
+      <w:rFonts w:ascii="Arial Unicode MS" w:hAnsi="Arial Unicode MS" w:eastAsia="Arial Unicode MS"/>
       <w:color w:val="000000" w:themeColor="text1"/>
     </w:rPr>
     <w:tblPr>
@@ -11995,6 +12508,7 @@
       <w:spacing w:after="0" w:line="240" w:lineRule="auto"/>
     </w:pPr>
     <w:rPr>
+      <w:rFonts w:ascii="Arial Unicode MS" w:hAnsi="Arial Unicode MS" w:eastAsia="Arial Unicode MS"/>
       <w:color w:val="000000" w:themeColor="text1"/>
     </w:rPr>
     <w:tblPr>
@@ -12081,6 +12595,7 @@
       <w:spacing w:after="0" w:line="240" w:lineRule="auto"/>
     </w:pPr>
     <w:rPr>
+      <w:rFonts w:ascii="Arial Unicode MS" w:hAnsi="Arial Unicode MS" w:eastAsia="Arial Unicode MS"/>
       <w:color w:val="000000" w:themeColor="text1"/>
     </w:rPr>
     <w:tblPr>
@@ -12167,6 +12682,7 @@
       <w:spacing w:after="0" w:line="240" w:lineRule="auto"/>
     </w:pPr>
     <w:rPr>
+      <w:rFonts w:ascii="Arial Unicode MS" w:hAnsi="Arial Unicode MS" w:eastAsia="Arial Unicode MS"/>
       <w:color w:val="000000" w:themeColor="text1"/>
     </w:rPr>
     <w:tblPr>
@@ -12247,6 +12763,7 @@
       <w:spacing w:after="0" w:line="240" w:lineRule="auto"/>
     </w:pPr>
     <w:rPr>
+      <w:rFonts w:ascii="Arial Unicode MS" w:hAnsi="Arial Unicode MS" w:eastAsia="Arial Unicode MS"/>
       <w:color w:val="000000" w:themeColor="text1"/>
     </w:rPr>
     <w:tblPr>
@@ -12327,6 +12844,7 @@
       <w:spacing w:after="0" w:line="240" w:lineRule="auto"/>
     </w:pPr>
     <w:rPr>
+      <w:rFonts w:ascii="Arial Unicode MS" w:hAnsi="Arial Unicode MS" w:eastAsia="Arial Unicode MS"/>
       <w:color w:val="000000" w:themeColor="text1"/>
     </w:rPr>
     <w:tblPr>
@@ -12407,6 +12925,7 @@
       <w:spacing w:after="0" w:line="240" w:lineRule="auto"/>
     </w:pPr>
     <w:rPr>
+      <w:rFonts w:ascii="Arial Unicode MS" w:hAnsi="Arial Unicode MS" w:eastAsia="Arial Unicode MS"/>
       <w:color w:val="000000" w:themeColor="text1"/>
     </w:rPr>
     <w:tblPr>
@@ -12487,6 +13006,7 @@
       <w:spacing w:after="0" w:line="240" w:lineRule="auto"/>
     </w:pPr>
     <w:rPr>
+      <w:rFonts w:ascii="Arial Unicode MS" w:hAnsi="Arial Unicode MS" w:eastAsia="Arial Unicode MS"/>
       <w:color w:val="000000" w:themeColor="text1"/>
     </w:rPr>
     <w:tblPr>
@@ -12567,6 +13087,7 @@
       <w:spacing w:after="0" w:line="240" w:lineRule="auto"/>
     </w:pPr>
     <w:rPr>
+      <w:rFonts w:ascii="Arial Unicode MS" w:hAnsi="Arial Unicode MS" w:eastAsia="Arial Unicode MS"/>
       <w:color w:val="000000" w:themeColor="text1"/>
     </w:rPr>
     <w:tblPr>
@@ -12647,6 +13168,7 @@
       <w:spacing w:after="0" w:line="240" w:lineRule="auto"/>
     </w:pPr>
     <w:rPr>
+      <w:rFonts w:ascii="Arial Unicode MS" w:hAnsi="Arial Unicode MS" w:eastAsia="Arial Unicode MS"/>
       <w:color w:val="000000" w:themeColor="text1"/>
     </w:rPr>
     <w:tblPr>

</xml_diff>

<commit_message>
docs: record redpacket display release and verification
</commit_message>
<xml_diff>
--- a/docs/learning.docx
+++ b/docs/learning.docx
@@ -1777,6 +1777,34 @@
         <w:t>设备解锁后，技术人员使用用户已正常登录的真实游小玲会话，完成新每日账单的生产财务只读补验：19渠道，10月13日与10月12日当天、14日至17日范围及390像素手机均已检查；金额输入、保存按钮和待核实任务均为0。仅最后一次10月13日刷新捕获到GET HTTP200，其余当天、范围和手机场景由真实渲染核对。未注入凭据或会话、填写或保存金额，原窗口和菜单已恢复。原发布时间2026-10-13 13:37:47及发布版本d467491f0318319be39fadb58e1ae22a8eff8bb4不变；员工本人试用和微信群真实金额对齐仍未完成。此前待设备解锁的记录保留为当时历史。</w:t>
       </w:r>
     </w:p>
+    <w:p>
+      <w:pPr>
+        <w:pStyle w:val="Heading2"/>
+        <w:keepNext/>
+      </w:pPr>
+      <w:r>
+        <w:rPr>
+          <w:color w:val="000000"/>
+        </w:rPr>
+        <w:t>账单顺序、费用颜色与欠款余额用语 2026年10月13日</w:t>
+      </w:r>
+    </w:p>
+    <w:p>
+      <w:pPr>
+        <w:keepLines/>
+      </w:pPr>
+      <w:r>
+        <w:t>用户明确每日账单把月结和预付全部放在上方、现结全部放在最后；红包费用为正数时用红色，真实0元用淡色，空白或未知不得按0处理。面向用户不再使用“群数”：月结显示“微信群还欠多少”，输入提示“填写欠款金额”；预付显示“微信群还剩多少”，输入提示“填写剩余金额，欠款填负数”。所有欠款、余额和本次付款／充值金额输入均显示¥；唯一主按钮改为“保存账目”，更大并固定在视口页底，无需滚到表格底部。本轮只调整顺序、颜色、文字和保存按钮布局，不改变金额、金融计算、后台或锁保护；显示修正正在验收，尚未上线，真实金额未代填。</w:t>
+      </w:r>
+    </w:p>
+    <w:p>
+      <w:pPr>
+        <w:keepLines/>
+      </w:pPr>
+      <w:r>
+        <w:t>北京时间2026-10-13 15:42:29本轮显示修正已上线，前端版本e8ac75be2edd3284ef8b5b57312e628a6855a0e1。真实主管、财务账号已只读核对19渠道、现结后置、费用红／0元灰、欠款余额标签、¥及桌面／手机固定“保存账目”；财务无金额输入或保存。后端d467及共享服务未变，金融、数据、账号和迁移写入均为0；员工本人试用和微信群金额核对仍未完成，过滤功能尚未授权或实现。资源验收教训：Nuxt零字节CSS合法，应核HTTP／MIME及构建manifest字节／SHA；loopback Nitro版本JSON可immutable，正式nginx应no-cache，各入口分开验。第三版检查通过，前两次隔离预览失败均未切换线上，失败证据保留。</w:t>
+      </w:r>
+    </w:p>
     <w:sectPr>
       <w:pgSz w:w="12240" w:h="15840"/>
       <w:pgMar w:top="1440" w:right="1800" w:bottom="1440" w:left="1800" w:header="720" w:footer="720" w:gutter="0"/>

</xml_diff>

<commit_message>
docs: finalize verified automatic redpacket accounting
</commit_message>
<xml_diff>
--- a/docs/learning.docx
+++ b/docs/learning.docx
@@ -1805,6 +1805,46 @@
         <w:t>北京时间2026-10-13 15:42:29本轮显示修正已上线，前端版本e8ac75be2edd3284ef8b5b57312e628a6855a0e1。真实主管、财务账号已只读核对19渠道、现结后置、费用红／0元灰、欠款余额标签、¥及桌面／手机固定“保存账目”；财务无金额输入或保存。后端d467及共享服务未变，金融、数据、账号和迁移写入均为0；员工本人试用和微信群金额核对仍未完成，过滤功能尚未授权或实现。资源验收教训：Nuxt零字节CSS合法，应核HTTP／MIME及构建manifest字节／SHA；loopback Nitro版本JSON可immutable，正式nginx应no-cache，各入口分开验。第三版检查通过，前两次隔离预览失败均未切换线上，失败证据保留。</w:t>
       </w:r>
     </w:p>
+    <w:p>
+      <w:pPr>
+        <w:pStyle w:val="Heading2"/>
+        <w:keepNext/>
+      </w:pPr>
+      <w:r>
+        <w:rPr>
+          <w:color w:val="000000"/>
+        </w:rPr>
+        <w:t>按所选日期已保存费用排序 2026年10月13日</w:t>
+      </w:r>
+    </w:p>
+    <w:p>
+      <w:pPr>
+        <w:keepLines/>
+      </w:pPr>
+      <w:r>
+        <w:t>本轮用户改为按金额排每日账单：所选一天或几天已保存红包费用大于0的渠道在前，按费用倒序；现结有费用也在前，但仍显示已结算。0费用后排，已登记真实资金或同截至日欠款／余额非0的渠道其次，未知记录保留，未知不当0。未设结算方式渠道也展示费用，只读，不替其设置标签或登记付款。排序只看已保存数据，编辑草稿不跳行；不筛选、不跨日自动结转、不改变真实账目、金融计算或后台保护。北京时间2026-10-13 16:52:01已上线，前端版本ce14fe7c1a8fcfa286f9ad0396099efad5014d36；原后端和共享服务未变，发布没有写入资金、数据、账号或迁移。此排序发布不代表后续自动账已上线。</w:t>
+      </w:r>
+    </w:p>
+    <w:p>
+      <w:pPr>
+        <w:pStyle w:val="Heading2"/>
+        <w:keepNext/>
+      </w:pPr>
+      <w:r>
+        <w:rPr>
+          <w:color w:val="000000"/>
+        </w:rPr>
+        <w:t>红包从真实当天起算自动累计 2026年10月13日</w:t>
+      </w:r>
+    </w:p>
+    <w:p>
+      <w:pPr>
+        <w:keepLines/>
+      </w:pPr>
+      <w:r>
+        <w:t>用户最新选择自动累计。首次任选实际过去一天，填写当天结束时微信群真实金额，包含当日及之前全部旧欠款或余额；月结负数是还欠、正数是多付，预付／预存正数是还剩、负数是还欠，未知不填0，17日只是例子。起始金额确认一次不能覆盖；当日及更早费用已含在真实起点中，后来补录也不能再次扣起点，但选定期间费用仍正常统计。从起点次日起，按实际业务日自动减费用、加真实付款或充值；补录业务加回原业务日，因此原日及后来余额会更新。更正当天费用保存相对原费用的固定差额，核准500后又补录100，最终费用600；不能把核准总额锁死或让补录继承已付。主按钮按所选渠道及费用日期范围登记实付，只登记现在仍未付的该范围全部金额；实际付款日另选，不固定20日，不得早于费用截止日或晚于今天。历史截至日欠款与当前可付剩余分开，后来已付的旧区间不能重复付款。预付独立充值只填本次新增真实款，不能填充值后余额；与起始金额同日的新资金须确为起始金额之后新发生的款，不能重复记旧款。余额核实差异只追加固定差额及原因，资金错误只整额撤销原资金、沿用原业务日；旧期初、原金额、审批和历史记录全部保留。财务只看费用、真实资金及截至日还欠／还剩，无填金额按钮或待核实任务。此前每日人工更新或仅沿用上次登记的口径作为历史保留；carry只读候选仅本机部分实现、没有上线，已被本轮自动方案替代。本机旧相关19项及本轮84项后台专项、前端36项单测及2项模拟浏览器场景通过。作者旧页面75项及红包浏览器12项维护通过，不改变已发布运行包。模拟账本也必须固定保留付款当时的按日分配，不能用动态抵扣或替换返回快照掩盖迟补后仍欠的新费用。最终Java17 JAR已正常登录完成20个独立本机接口请求，财务登录与拒绝充值另2个请求通过；原业务记录未变，测试进程已停。北京时间2026-10-13 19:25:05本轮自动账已实际发布，版本bfb00e0e。公开入口与资源已核对，采集与MySQL共享服务未变；发布未写入资金或数据、未改账号角色或数据库结构；11项high风险维持本次已接受范围，critical为0，此例外不延续到以后。廖宇杰现有登录账号只读走查通过：20个渠道自动账字段齐全，真实起点均未填写；13日费用700元、12日5532元、两日6232元相加一致，检查期间没有登记资金。技术发布不代表员工本人已试用、真实微信群金额已对齐或银行已转账，这三项仍未核实。</w:t>
+      </w:r>
+    </w:p>
     <w:sectPr>
       <w:pgSz w:w="12240" w:h="15840"/>
       <w:pgMar w:top="1440" w:right="1800" w:bottom="1440" w:left="1800" w:header="720" w:footer="720" w:gutter="0"/>

</xml_diff>

<commit_message>
docs: finalize verified prepaid new-period accounting
</commit_message>
<xml_diff>
--- a/docs/learning.docx
+++ b/docs/learning.docx
@@ -1845,6 +1845,43 @@
         <w:t>用户最新选择自动累计。首次任选实际过去一天，填写当天结束时微信群真实金额，包含当日及之前全部旧欠款或余额；月结负数是还欠、正数是多付，预付／预存正数是还剩、负数是还欠，未知不填0，17日只是例子。起始金额确认一次不能覆盖；当日及更早费用已含在真实起点中，后来补录也不能再次扣起点，但选定期间费用仍正常统计。从起点次日起，按实际业务日自动减费用、加真实付款或充值；补录业务加回原业务日，因此原日及后来余额会更新。更正当天费用保存相对原费用的固定差额，核准500后又补录100，最终费用600；不能把核准总额锁死或让补录继承已付。主按钮按所选渠道及费用日期范围登记实付，只登记现在仍未付的该范围全部金额；实际付款日另选，不固定20日，不得早于费用截止日或晚于今天。历史截至日欠款与当前可付剩余分开，后来已付的旧区间不能重复付款。预付独立充值只填本次新增真实款，不能填充值后余额；与起始金额同日的新资金须确为起始金额之后新发生的款，不能重复记旧款。余额核实差异只追加固定差额及原因，资金错误只整额撤销原资金、沿用原业务日；旧期初、原金额、审批和历史记录全部保留。财务只看费用、真实资金及截至日还欠／还剩，无填金额按钮或待核实任务。此前每日人工更新或仅沿用上次登记的口径作为历史保留；carry只读候选仅本机部分实现、没有上线，已被本轮自动方案替代。本机旧相关19项及本轮84项后台专项、前端36项单测及2项模拟浏览器场景通过。作者旧页面75项及红包浏览器12项维护通过，不改变已发布运行包。模拟账本也必须固定保留付款当时的按日分配，不能用动态抵扣或替换返回快照掩盖迟补后仍欠的新费用。最终Java17 JAR已正常登录完成20个独立本机接口请求，财务登录与拒绝充值另2个请求通过；原业务记录未变，测试进程已停。北京时间2026-10-13 19:25:05本轮自动账已实际发布，版本bfb00e0e。公开入口与资源已核对，采集与MySQL共享服务未变；发布未写入资金或数据、未改账号角色或数据库结构；11项high风险维持本次已接受范围，critical为0，此例外不延续到以后。廖宇杰现有登录账号只读走查通过：20个渠道自动账字段齐全，真实起点均未填写；13日费用700元、12日5532元、两日6232元相加一致，检查期间没有登记资金。技术发布不代表员工本人已试用、真实微信群金额已对齐或银行已转账，这三项仍未核实。</w:t>
       </w:r>
     </w:p>
+    <w:p>
+      <w:pPr>
+        <w:pStyle w:val="Heading2"/>
+        <w:keepNext/>
+      </w:pPr>
+      <w:r>
+        <w:rPr>
+          <w:rFonts w:ascii="Heiti SC" w:hAnsi="Heiti SC" w:eastAsia="Heiti SC"/>
+          <w:color w:val="000000"/>
+        </w:rPr>
+        <w:t>预存按新阶段自动扣费 2026年10月14日</w:t>
+      </w:r>
+    </w:p>
+    <w:p>
+      <w:pPr>
+        <w:keepLines/>
+      </w:pPr>
+      <w:r>
+        <w:rPr>
+          <w:rFonts w:ascii="Heiti SC" w:hAnsi="Heiti SC" w:eastAsia="Heiti SC"/>
+          <w:color w:val="000000"/>
+        </w:rPr>
+        <w:t>用户纠正预存操作：所有预存渠道直接可见，每个渠道都有明显的“充值”和“改余额”，不再要求先逐个填个人起始金额才能使用。群里原本已有钱时，点“改余额”填写当前核实的实际剩余；它是核准截至日余额，不是假充值，也不伪造一笔旧资金或银行凭证。真正新发生充值时，点“充值”只登记本次新增金额；充值增加已登记资金，红包费用按实际业务日期自动扣，余额不同于累计充值额。只用算式说明：充值1650元、费用50元，余额1600元；示例不是任何渠道真实数，技术人员不能据此代填。新阶段起点当前配置2026-10-17，含17日当天费用，如需调整由用户再确认；查询仍可选择一天或几天，不能把查询起止日期当成重置余额。没有登记充值时，新阶段已记录费用会形成负的账面余额，这说明已登记资金不足；不能用假充值凑平或声称技术人员已核对真实群余额。统一起点在第一次实际授权写入时持久化为非资金模块元数据，不为每个未开户渠道伪造START、期初或资金记录；读取不会写入。17日前的旧记录、原金额与已确认截至日起点保留可读，月结及原已确认起始数不被覆盖。财务只查看，既有人员权限不扩大。本轮验证和发布状态以本节新记录的证据为准，13日已上线自动账保留为上一版历史。</w:t>
+      </w:r>
+    </w:p>
+    <w:p>
+      <w:pPr>
+        <w:keepLines/>
+      </w:pPr>
+      <w:r>
+        <w:rPr>
+          <w:rFonts w:ascii="Heiti SC" w:hAnsi="Heiti SC" w:eastAsia="Heiti SC"/>
+          <w:color w:val="000000"/>
+        </w:rPr>
+        <w:t>本轮预存简化已于北京时间2026-10-14 10:04:38实际上线，版本18a0d1ec。公开入口与资源已核对；本次发布未登记真实资金、改账号或数据库结构。员工本人试用、真实群余额对齐及银行转账仍须分别核实。</w:t>
+      </w:r>
+    </w:p>
     <w:sectPr>
       <w:pgSz w:w="12240" w:h="15840"/>
       <w:pgMar w:top="1440" w:right="1800" w:bottom="1440" w:left="1800" w:header="720" w:footer="720" w:gutter="0"/>

</xml_diff>

<commit_message>
docs: distinguish fund registration from expense start date
</commit_message>
<xml_diff>
--- a/docs/learning.docx
+++ b/docs/learning.docx
@@ -1882,6 +1882,43 @@
         <w:t>本轮预存简化已于北京时间2026-10-14 10:04:38实际上线，版本18a0d1ec。公开入口与资源已核对；本次发布未登记真实资金、改账号或数据库结构。员工本人试用、真实群余额对齐及银行转账仍须分别核实。</w:t>
       </w:r>
     </w:p>
+    <w:p>
+      <w:pPr>
+        <w:pStyle w:val="Heading2"/>
+        <w:keepNext/>
+      </w:pPr>
+      <w:r>
+        <w:rPr>
+          <w:rFonts w:ascii="Heiti SC" w:hAnsi="Heiti SC" w:eastAsia="Heiti SC"/>
+          <w:color w:val="000000"/>
+        </w:rPr>
+        <w:t>登记入口与费用起算日分开 2026年10月14日</w:t>
+      </w:r>
+    </w:p>
+    <w:p>
+      <w:pPr>
+        <w:keepLines/>
+      </w:pPr>
+      <w:r>
+        <w:rPr>
+          <w:rFonts w:ascii="Heiti SC" w:hAnsi="Heiti SC" w:eastAsia="Heiti SC"/>
+          <w:color w:val="000000"/>
+        </w:rPr>
+        <w:t>起扣日只决定从哪天开始计算费用，不应锁住资金登记入口。今天或过去实际日期已经发生的新充值可立即登记，已有资金用余额更正核实，充值增量与实际剩余余额分开填写。起扣日前本轮已登记资金会延续到新阶段，旧费用不重复扣；旧记录保留可查。查询日期不等于起扣日，真实未来资金不提前登记。</w:t>
+      </w:r>
+    </w:p>
+    <w:p>
+      <w:pPr>
+        <w:keepLines/>
+      </w:pPr>
+      <w:r>
+        <w:rPr>
+          <w:rFonts w:ascii="Heiti SC" w:hAnsi="Heiti SC" w:eastAsia="Heiti SC"/>
+          <w:color w:val="000000"/>
+        </w:rPr>
+        <w:t>本条只记录交互与记账规则，真实金额仍需由操作人员核实。</w:t>
+      </w:r>
+    </w:p>
     <w:sectPr>
       <w:pgSz w:w="12240" w:h="15840"/>
       <w:pgMar w:top="1440" w:right="1800" w:bottom="1440" w:left="1800" w:header="720" w:footer="720" w:gutter="0"/>

</xml_diff>

<commit_message>
docs: distinguish fee correction from deduction start
</commit_message>
<xml_diff>
--- a/docs/learning.docx
+++ b/docs/learning.docx
@@ -1917,6 +1917,43 @@
           <w:color w:val="000000"/>
         </w:rPr>
         <w:t>本条只记录交互与记账规则，真实金额仍需由操作人员核实。</w:t>
+      </w:r>
+    </w:p>
+    <w:p>
+      <w:pPr>
+        <w:pStyle w:val="Heading2"/>
+        <w:keepNext/>
+      </w:pPr>
+      <w:r>
+        <w:rPr>
+          <w:rFonts w:ascii="Heiti SC" w:hAnsi="Heiti SC" w:eastAsia="Heiti SC"/>
+          <w:color w:val="000000"/>
+        </w:rPr>
+        <w:t>费用更正与自动扣费日期分开 2026年10月14日</w:t>
+      </w:r>
+    </w:p>
+    <w:p>
+      <w:pPr>
+        <w:keepLines/>
+      </w:pPr>
+      <w:r>
+        <w:rPr>
+          <w:rFonts w:ascii="Heiti SC" w:hAnsi="Heiti SC" w:eastAsia="Heiti SC"/>
+          <w:color w:val="000000"/>
+        </w:rPr>
+        <w:t>费用可以按核实结果更正，先选具体一天，填当天总额并写原因。自动扣费起点只决定从哪天开始扣余额，不应锁住费用更正入口；起点以前更正费用也不扣新余额。补录费用归到原实际业务日，旧记录保留。</w:t>
+      </w:r>
+    </w:p>
+    <w:p>
+      <w:pPr>
+        <w:keepLines/>
+      </w:pPr>
+      <w:r>
+        <w:rPr>
+          <w:rFonts w:ascii="Heiti SC" w:hAnsi="Heiti SC" w:eastAsia="Heiti SC"/>
+          <w:color w:val="000000"/>
+        </w:rPr>
+        <w:t>本条记录通用交互与记账规则，真实金额由操作人员核实。</w:t>
       </w:r>
     </w:p>
     <w:sectPr>

</xml_diff>